<commit_message>
Update Word documentation with cloud 24/7 deployment guide
</commit_message>
<xml_diff>
--- a/Documentacion_Portal_Viaticos_Mexico.docx
+++ b/Documentacion_Portal_Viaticos_Mexico.docx
@@ -2898,6 +2898,69 @@
         <w:t>7. Guía Rápida para Abrir el Portal y Conectar la App</w:t>
       </w:r>
     </w:p>
+    <w:tbl>
+      <w:tblPr>
+        <w:tblW w:type="auto" w:w="0"/>
+        <w:jc w:val="center"/>
+        <w:tblLayout w:type="fixed"/>
+        <w:tblLook w:firstColumn="1" w:firstRow="1" w:lastColumn="0" w:lastRow="0" w:noHBand="0" w:noVBand="1" w:val="04A0"/>
+      </w:tblPr>
+      <w:tblGrid>
+        <w:gridCol w:w="9936"/>
+      </w:tblGrid>
+      <w:tr>
+        <w:tc>
+          <w:tcPr>
+            <w:tcW w:type="dxa" w:w="9360"/>
+            <w:shd w:fill="F0FDF4"/>
+            <w:tcMar>
+              <w:top w:w="120" w:type="dxa"/>
+              <w:bottom w:w="120" w:type="dxa"/>
+              <w:left w:w="180" w:type="dxa"/>
+              <w:right w:w="180" w:type="dxa"/>
+            </w:tcMar>
+            <w:tcBorders>
+              <w:left w:val="single" w:sz="24" w:space="0" w:color="10B981"/>
+              <w:top w:val="none"/>
+              <w:right w:val="none"/>
+              <w:bottom w:val="none"/>
+            </w:tcBorders>
+          </w:tcPr>
+          <w:p>
+            <w:pPr>
+              <w:spacing w:before="40" w:after="40" w:line="276" w:lineRule="auto"/>
+            </w:pPr>
+            <w:r>
+              <w:rPr>
+                <w:b/>
+                <w:color w:val="0F4C3A"/>
+                <w:sz w:val="20"/>
+              </w:rPr>
+              <w:t>Despliegue Cloud en Vivo 24/7 (100% Gratuito)</w:t>
+              <w:br/>
+            </w:r>
+            <w:r>
+              <w:rPr>
+                <w:color w:val="334155"/>
+                <w:sz w:val="19"/>
+              </w:rPr>
+              <w:t>• URL Oficial en la Nube: https://jlg-facturacion.onrender.com/</w:t>
+              <w:br/>
+              <w:t>• Estado: Producción Activa (Live)</w:t>
+              <w:br/>
+              <w:t>• Disponibilidad: 24 horas del día, los 365 días del año sin necesidad de encender la computadora del administrador.</w:t>
+              <w:br/>
+              <w:t>• Conectividad: Acceso universal desde cualquier red Wi-Fi o datos móviles (4G/5G).</w:t>
+            </w:r>
+          </w:p>
+        </w:tc>
+      </w:tr>
+    </w:tbl>
+    <w:p>
+      <w:pPr>
+        <w:spacing w:after="80"/>
+      </w:pPr>
+    </w:p>
     <w:p>
       <w:pPr>
         <w:pStyle w:val="Heading2"/>
@@ -2910,7 +2973,7 @@
           <w:color w:val="1E40AF"/>
           <w:sz w:val="24"/>
         </w:rPr>
-        <w:t>7.1 Cómo Abrir el Portal en tu Computadora</w:t>
+        <w:t>7.1 Cómo Abrir el Portal Web en Cualquier Computadora o Celular</w:t>
       </w:r>
     </w:p>
     <w:p>
@@ -2923,14 +2986,14 @@
           <w:color w:val="0F172A"/>
           <w:sz w:val="20"/>
         </w:rPr>
-        <w:t xml:space="preserve">Paso 1: Navegador: </w:t>
+        <w:t xml:space="preserve">Paso 1: Acceso Directo: </w:t>
       </w:r>
       <w:r>
         <w:rPr>
           <w:color w:val="334155"/>
           <w:sz w:val="20"/>
         </w:rPr>
-        <w:t>Abre Google Chrome, Edge o Firefox e ingresa a: http://localhost:4000</w:t>
+        <w:t>Abre cualquier navegador web (Chrome, Edge, Safari, Firefox) e ingresa directamente a: https://jlg-facturacion.onrender.com/</w:t>
       </w:r>
     </w:p>
     <w:p>
@@ -2950,7 +3013,7 @@
           <w:color w:val="334155"/>
           <w:sz w:val="20"/>
         </w:rPr>
-        <w:t>Toca la tarjeta de tu nombre e introduce tu clave confidencial (ej. JALM-2026).</w:t>
+        <w:t>Toca la tarjeta de tu nombre e introduce tu clave confidencial alfanumérica (ej. JALM-2026, SCNR-2026). Tus saldos se revelarán.</w:t>
       </w:r>
     </w:p>
     <w:p>
@@ -2970,7 +3033,7 @@
           <w:color w:val="334155"/>
           <w:sz w:val="20"/>
         </w:rPr>
-        <w:t>Haz clic en 'Acceso Administrador' e introduce DamianSpears_Owner / Papaleta723! para acceder a la pestaña de administración y auditar facturas.</w:t>
+        <w:t>Haz clic en 'Acceso Administrador' e introduce DamianSpears_Owner / Papaleta723! para acceder a la pestaña de administración, auditar facturas de cada colaborador y Aceptar o Rechazar gastos.</w:t>
       </w:r>
     </w:p>
     <w:p>
@@ -2985,7 +3048,7 @@
           <w:color w:val="1E40AF"/>
           <w:sz w:val="24"/>
         </w:rPr>
-        <w:t>7.2 Cómo Conectar los Celulares de los Usuarios</w:t>
+        <w:t>7.2 Cómo Conectar los Celulares de los Usuarios (App Android)</w:t>
       </w:r>
     </w:p>
     <w:p>
@@ -3005,7 +3068,7 @@
           <w:color w:val="334155"/>
           <w:sz w:val="20"/>
         </w:rPr>
-        <w:t>Copia el archivo 'JLG_Facturacion.apk' a los celulares de los colaboradores (vía USB, WhatsApp o correo) e instálalo habilitando 'Instalar apps desconocidas'.</w:t>
+        <w:t>Copia el archivo 'JLG_Facturacion.apk' a los celulares de los colaboradores (vía WhatsApp, correo o Google Drive) e instálalo habilitando 'Instalar apps desconocidas'.</w:t>
       </w:r>
     </w:p>
     <w:p>
@@ -3018,14 +3081,14 @@
           <w:color w:val="0F172A"/>
           <w:sz w:val="20"/>
         </w:rPr>
-        <w:t xml:space="preserve">Paso 2: Red WiFi: </w:t>
+        <w:t xml:space="preserve">Paso 2: Conexión Automática: </w:t>
       </w:r>
       <w:r>
         <w:rPr>
           <w:color w:val="334155"/>
           <w:sz w:val="20"/>
         </w:rPr>
-        <w:t>Los celulares deben estar conectados a la misma red WiFi que la computadora.</w:t>
+        <w:t>La aplicación ya viene configurada de fábrica con la URL cloud 'https://jlg-facturacion.onrender.com/api/'. En cuanto el colaborador abre la app, esta se conecta automáticamente a la nube.</w:t>
       </w:r>
     </w:p>
     <w:p>
@@ -3038,14 +3101,14 @@
           <w:color w:val="0F172A"/>
           <w:sz w:val="20"/>
         </w:rPr>
-        <w:t xml:space="preserve">Paso 3: Servidor: </w:t>
+        <w:t xml:space="preserve">Paso 3: Conexión Universal: </w:t>
       </w:r>
       <w:r>
         <w:rPr>
           <w:color w:val="334155"/>
           <w:sz w:val="20"/>
         </w:rPr>
-        <w:t>En la esquina superior derecha de la app, presiona el engrane ⚙️ e introduce la dirección IP de tu computadora (ej. http://192.168.100.52:4000/).</w:t>
+        <w:t>Los colaboradores pueden estar en su casa, en la oficina o en carretera con datos móviles 4G/5G. No se requiere estar en la misma red Wi-Fi.</w:t>
       </w:r>
     </w:p>
     <w:p>
@@ -3058,14 +3121,14 @@
           <w:color w:val="0F172A"/>
           <w:sz w:val="20"/>
         </w:rPr>
-        <w:t xml:space="preserve">Paso 4: Uso Diario: </w:t>
+        <w:t xml:space="preserve">Paso 4: Flexibilidad de Servidor: </w:t>
       </w:r>
       <w:r>
         <w:rPr>
           <w:color w:val="334155"/>
           <w:sz w:val="20"/>
         </w:rPr>
-        <w:t>La app sincronizará de inmediato el catálogo de colaboradores y permitirá subir comprobantes XML con validación en vivo.</w:t>
+        <w:t>Si en el futuro se desea apuntar a otro servidor privado o red local, la app cuenta con el botón de engrane ⚙️ en la esquina superior derecha para personalizar la URL del backend.</w:t>
       </w:r>
     </w:p>
     <w:sectPr>

</xml_diff>

<commit_message>
feat: Add Android app APK download link and synchronized updates
</commit_message>
<xml_diff>
--- a/Documentacion_Portal_Viaticos_Mexico.docx
+++ b/Documentacion_Portal_Viaticos_Mexico.docx
@@ -2973,7 +2973,7 @@
           <w:color w:val="1E40AF"/>
           <w:sz w:val="24"/>
         </w:rPr>
-        <w:t>7.1 Cómo Abrir el Portal Web en Cualquier Computadora o Celular</w:t>
+        <w:t>7.1 Cómo Usar la Nueva Pantalla de Inicio / Bienvenida del Portal</w:t>
       </w:r>
     </w:p>
     <w:p>
@@ -2993,7 +2993,7 @@
           <w:color w:val="334155"/>
           <w:sz w:val="20"/>
         </w:rPr>
-        <w:t>Abre cualquier navegador web (Chrome, Edge, Safari, Firefox) e ingresa directamente a: https://jlg-facturacion.onrender.com/</w:t>
+        <w:t>Abre cualquier navegador web (Chrome, Edge, Safari, Firefox) e ingresa directamente a: https://jlg-facturacion.onrender.com/ El sistema te recibirá con la nueva Pantalla de Inicio y Bienvenida corporativa.</w:t>
       </w:r>
     </w:p>
     <w:p>
@@ -3006,14 +3006,14 @@
           <w:color w:val="0F172A"/>
           <w:sz w:val="20"/>
         </w:rPr>
-        <w:t xml:space="preserve">Paso 2: Modo Colaborador: </w:t>
+        <w:t xml:space="preserve">Paso 2: Acceso por Nombre Completo (Colaboradores): </w:t>
       </w:r>
       <w:r>
         <w:rPr>
           <w:color w:val="334155"/>
           <w:sz w:val="20"/>
         </w:rPr>
-        <w:t>Toca la tarjeta de tu nombre e introduce tu clave confidencial alfanumérica (ej. JALM-2026, SCNR-2026). Tus saldos se revelarán.</w:t>
+        <w:t>En la tarjeta izquierda 'Acceso a Comisionados', despliega el selector por Nombre Completo, visualiza tu resumen de viaje (destino, RFC, avatar) e introduce tu clave alfanumérica confidencial (ej. JALM-2026). Al presionar 'Ingresar a mis Viáticos', accederás directamente a tu comprobación y subida de XML.</w:t>
       </w:r>
     </w:p>
     <w:p>
@@ -3026,14 +3026,34 @@
           <w:color w:val="0F172A"/>
           <w:sz w:val="20"/>
         </w:rPr>
-        <w:t xml:space="preserve">Paso 3: Modo Administrador: </w:t>
+        <w:t xml:space="preserve">Paso 3: Acceso Directo de Administrador: </w:t>
       </w:r>
       <w:r>
         <w:rPr>
           <w:color w:val="334155"/>
           <w:sz w:val="20"/>
         </w:rPr>
-        <w:t>Haz clic en 'Acceso Administrador' e introduce DamianSpears_Owner / Papaleta723! para acceder a la pestaña de administración, auditar facturas de cada colaborador y Aceptar o Rechazar gastos.</w:t>
+        <w:t>En la tarjeta derecha 'Iniciar como Administrador', introduce las credenciales maestras (DamianSpears_Owner / Papaleta723!) y haz clic en 'Iniciar como Administrador'. Accederás inmediatamente al Panel de Auditoría para aprobar o rechazar facturas y dar de alta nuevo personal.</w:t>
+      </w:r>
+    </w:p>
+    <w:p>
+      <w:pPr>
+        <w:spacing w:before="0" w:after="80" w:line="276" w:lineRule="auto"/>
+      </w:pPr>
+      <w:r>
+        <w:rPr>
+          <w:b/>
+          <w:color w:val="0F172A"/>
+          <w:sz w:val="20"/>
+        </w:rPr>
+        <w:t xml:space="preserve">Paso 4: Cambio de Usuario y Cierre de Sesión: </w:t>
+      </w:r>
+      <w:r>
+        <w:rPr>
+          <w:color w:val="334155"/>
+          <w:sz w:val="20"/>
+        </w:rPr>
+        <w:t>Tanto en el portal de comprobación como en el panel administrador dispones del botón 'Cerrar Sesión / Cambiar Colaborador' en la barra superior para volver de manera inmediata y segura a la Pantalla de Inicio.</w:t>
       </w:r>
     </w:p>
     <w:p>

</xml_diff>

<commit_message>
docs: Update comprehensive Word documentation with v3.0 stack and specs
</commit_message>
<xml_diff>
--- a/Documentacion_Portal_Viaticos_Mexico.docx
+++ b/Documentacion_Portal_Viaticos_Mexico.docx
@@ -21,7 +21,7 @@
           <w:color w:val="0F4C3A"/>
           <w:sz w:val="34"/>
         </w:rPr>
-        <w:t>JLG FACTURACIÓN | ECOSISTEMA DE VIÁTICOS Y COMPROBACIONES MÉXICO</w:t>
+        <w:t>JLG FACTURACIÓN | ECOSISTEMA CORPORATIVO DE VIÁTICOS Y AUDITORÍA FISCAL</w:t>
         <w:br/>
       </w:r>
       <w:r>
@@ -29,7 +29,7 @@
           <w:color w:val="1E40AF"/>
           <w:sz w:val="23"/>
         </w:rPr>
-        <w:t>Manual Técnico Integral, Portal Web, App Android, Módulo Administrador y Auditoría Fiscal CFDI 4.0</w:t>
+        <w:t>Manual Técnico y Operativo Integral: Portal Web, App Android Nativa, Generador CFDI 4.0, Módulo de Auditoría y Despliegue Cloud</w:t>
       </w:r>
     </w:p>
     <w:p>
@@ -42,7 +42,7 @@
           <w:color w:val="64748B"/>
           <w:sz w:val="18"/>
         </w:rPr>
-        <w:t>Versión: 2.5.0  |  Normativa: SAT Anexo 20 / CFDI 4.0 / Art. 28 LISR  |  Fecha: Octubre 2026</w:t>
+        <w:t>Versión: 3.0.0  |  Normativa: SAT Anexo 20 / CFDI 4.0 / Art. 28 LISR  |  Fecha de Actualización: Octubre 2026</w:t>
       </w:r>
     </w:p>
     <w:p>
@@ -74,7 +74,7 @@
           <w:color w:val="334155"/>
           <w:sz w:val="20"/>
         </w:rPr>
-        <w:t>Jlg Facturación es una suite empresarial omnicanal compuesta por una plataforma Web full-stack y una aplicación móvil nativa para Android, desarrollada específicamente para resolver el ciclo integral de comprobación de viáticos y representación en México. Su objetivo central es garantizar que el 100% de los gastos deducibles cumplan a cabalidad con los estándares de validación estructural del SAT (CFDI 4.0) y con los topes legales del Artículo 28 Fracción V de la Ley del Impuesto sobre la Renta (LISR).</w:t>
+        <w:t>Jlg Facturación es una solución omnicanal de grado empresarial concebida para la gestión, control, comprobación y auditoría integral de viáticos corporativos en México. La plataforma fusiona un backend de alto rendimiento en Node.js, un portal web reactivo y una aplicación nativa para Android en Kotlin. El sistema automatiza el 100% de la conciliación fiscal conforme a los lineamientos del Anexo 20 del SAT (CFDI 4.0) y a las deducciones autorizadas bajo el Artículo 28 Fracción V de la Ley del Impuesto sobre la Renta (LISR).</w:t>
       </w:r>
     </w:p>
     <w:tbl>
@@ -115,7 +115,7 @@
                 <w:color w:val="0F4C3A"/>
                 <w:sz w:val="20"/>
               </w:rPr>
-              <w:t>Principales Capacidades y Novedades de la Versión 2.5.0</w:t>
+              <w:t>Aspectos Clave y Logros de la Versión 3.0.0</w:t>
               <w:br/>
             </w:r>
             <w:r>
@@ -123,13 +123,13 @@
                 <w:color w:val="334155"/>
                 <w:sz w:val="19"/>
               </w:rPr>
-              <w:t>• Sincronización Bidireccional Web / Android: Los colaboradores suben sus facturas XML desde su smartphone o la computadora y se reflejan en tiempo real en ambos entornos.</w:t>
+              <w:t>• Generador y Validador Directo CFDI 4.0 en Android: Registro inmediato de comprobantes sin requerir la preexistencia de archivos XML descargados en el smartphone.</w:t>
               <w:br/>
-              <w:t>• Módulo Administrador con Inspección de Movimientos: El administrador puede auditar el viaje de cada colaborador, revisar facturas individuales y Aceptarlas o Rechazarlas con recálculo dinámico de saldos.</w:t>
+              <w:t>• Ingreso Administrativo Unificado y Discreto: Acceso maestro integrado de forma natural en el directorio de colaboradores de la web, eliminando secciones o botones llamativos de administración externa.</w:t>
               <w:br/>
-              <w:t>• Claves Alfanuméricas y Privacidad Multinivel: Soporte para contraseñas con caracteres alfanuméricos (ej. JALM-2026) y enmascaramiento con asteriscos.</w:t>
+              <w:t>• Módulo de Administración Integral: Altas con 12 campos fiscales/operativos, edición en vivo de colaboradores registrados y rechazo con justificación obligatoria de auditoría.</w:t>
               <w:br/>
-              <w:t>• Persistencia de Datos en Disco: Almacenamiento JSON seguro en el servidor para evitar pérdida de registros en reinicios.</w:t>
+              <w:t>• Despliegue Cloud 24/7 en Render con CI/CD: Infraestructura en la nube con sincronización continua desde GitHub y descarga directa del instalador APK.</w:t>
             </w:r>
           </w:p>
         </w:tc>
@@ -152,7 +152,7 @@
           <w:color w:val="0F4C3A"/>
           <w:sz w:val="30"/>
         </w:rPr>
-        <w:t>2. Catálogo Oficial de Usuarios y Credenciales de Acceso</w:t>
+        <w:t>2. Arquitectura del Sistema y Tecnologías Utilizadas</w:t>
       </w:r>
     </w:p>
     <w:p>
@@ -164,7 +164,708 @@
           <w:color w:val="334155"/>
           <w:sz w:val="20"/>
         </w:rPr>
-        <w:t>A continuación se detalla la nómina de colaboradores registrados en el sistema, sus puestos, destinos de viaje asignados y sus claves únicas de acceso confidencial:</w:t>
+        <w:t>El ecosistema está construido sobre estándares modernos y librerías probadas en producción:</w:t>
+      </w:r>
+    </w:p>
+    <w:tbl>
+      <w:tblPr>
+        <w:tblW w:type="auto" w:w="0"/>
+        <w:jc w:val="center"/>
+        <w:tblLayout w:type="fixed"/>
+        <w:tblLook w:firstColumn="1" w:firstRow="1" w:lastColumn="0" w:lastRow="0" w:noHBand="0" w:noVBand="1" w:val="04A0"/>
+      </w:tblPr>
+      <w:tblGrid>
+        <w:gridCol w:w="2484"/>
+        <w:gridCol w:w="2484"/>
+        <w:gridCol w:w="2484"/>
+        <w:gridCol w:w="2484"/>
+      </w:tblGrid>
+      <w:tr>
+        <w:tc>
+          <w:tcPr>
+            <w:tcW w:type="dxa" w:w="2160"/>
+            <w:shd w:fill="0F4C3A"/>
+            <w:tcMar>
+              <w:top w:w="100" w:type="dxa"/>
+              <w:bottom w:w="100" w:type="dxa"/>
+              <w:left w:w="120" w:type="dxa"/>
+              <w:right w:w="120" w:type="dxa"/>
+            </w:tcMar>
+          </w:tcPr>
+          <w:p>
+            <w:pPr>
+              <w:jc w:val="center"/>
+            </w:pPr>
+            <w:r>
+              <w:rPr>
+                <w:b/>
+                <w:color w:val="FFFFFF"/>
+                <w:sz w:val="18"/>
+              </w:rPr>
+              <w:t>Capa / Entorno</w:t>
+            </w:r>
+          </w:p>
+        </w:tc>
+        <w:tc>
+          <w:tcPr>
+            <w:tcW w:type="dxa" w:w="2592"/>
+            <w:shd w:fill="0F4C3A"/>
+            <w:tcMar>
+              <w:top w:w="100" w:type="dxa"/>
+              <w:bottom w:w="100" w:type="dxa"/>
+              <w:left w:w="120" w:type="dxa"/>
+              <w:right w:w="120" w:type="dxa"/>
+            </w:tcMar>
+          </w:tcPr>
+          <w:p>
+            <w:pPr>
+              <w:jc w:val="center"/>
+            </w:pPr>
+            <w:r>
+              <w:rPr>
+                <w:b/>
+                <w:color w:val="FFFFFF"/>
+                <w:sz w:val="18"/>
+              </w:rPr>
+              <w:t>Tecnología Principal</w:t>
+            </w:r>
+          </w:p>
+        </w:tc>
+        <w:tc>
+          <w:tcPr>
+            <w:tcW w:type="dxa" w:w="2304"/>
+            <w:shd w:fill="0F4C3A"/>
+            <w:tcMar>
+              <w:top w:w="100" w:type="dxa"/>
+              <w:bottom w:w="100" w:type="dxa"/>
+              <w:left w:w="120" w:type="dxa"/>
+              <w:right w:w="120" w:type="dxa"/>
+            </w:tcMar>
+          </w:tcPr>
+          <w:p>
+            <w:pPr>
+              <w:jc w:val="center"/>
+            </w:pPr>
+            <w:r>
+              <w:rPr>
+                <w:b/>
+                <w:color w:val="FFFFFF"/>
+                <w:sz w:val="18"/>
+              </w:rPr>
+              <w:t>Librerías / Dependencias Clave</w:t>
+            </w:r>
+          </w:p>
+        </w:tc>
+        <w:tc>
+          <w:tcPr>
+            <w:tcW w:type="dxa" w:w="2304"/>
+            <w:shd w:fill="0F4C3A"/>
+            <w:tcMar>
+              <w:top w:w="100" w:type="dxa"/>
+              <w:bottom w:w="100" w:type="dxa"/>
+              <w:left w:w="120" w:type="dxa"/>
+              <w:right w:w="120" w:type="dxa"/>
+            </w:tcMar>
+          </w:tcPr>
+          <w:p>
+            <w:pPr>
+              <w:jc w:val="center"/>
+            </w:pPr>
+            <w:r>
+              <w:rPr>
+                <w:b/>
+                <w:color w:val="FFFFFF"/>
+                <w:sz w:val="18"/>
+              </w:rPr>
+              <w:t>Función en el Ecosistema</w:t>
+            </w:r>
+          </w:p>
+        </w:tc>
+      </w:tr>
+      <w:tr>
+        <w:tc>
+          <w:tcPr>
+            <w:tcW w:type="dxa" w:w="2160"/>
+            <w:shd w:fill="FFFFFF"/>
+            <w:tcMar>
+              <w:top w:w="90" w:type="dxa"/>
+              <w:bottom w:w="90" w:type="dxa"/>
+              <w:left w:w="120" w:type="dxa"/>
+              <w:right w:w="120" w:type="dxa"/>
+            </w:tcMar>
+          </w:tcPr>
+          <w:p>
+            <w:pPr>
+              <w:jc w:val="left"/>
+            </w:pPr>
+            <w:r>
+              <w:rPr>
+                <w:color w:val="1E293B"/>
+                <w:sz w:val="17"/>
+              </w:rPr>
+              <w:t>Backend REST API</w:t>
+            </w:r>
+          </w:p>
+        </w:tc>
+        <w:tc>
+          <w:tcPr>
+            <w:tcW w:type="dxa" w:w="2592"/>
+            <w:shd w:fill="FFFFFF"/>
+            <w:tcMar>
+              <w:top w:w="90" w:type="dxa"/>
+              <w:bottom w:w="90" w:type="dxa"/>
+              <w:left w:w="120" w:type="dxa"/>
+              <w:right w:w="120" w:type="dxa"/>
+            </w:tcMar>
+          </w:tcPr>
+          <w:p>
+            <w:pPr>
+              <w:jc w:val="left"/>
+            </w:pPr>
+            <w:r>
+              <w:rPr>
+                <w:color w:val="1E293B"/>
+                <w:sz w:val="17"/>
+              </w:rPr>
+              <w:t>Node.js v20+ / Express 4.19</w:t>
+            </w:r>
+          </w:p>
+        </w:tc>
+        <w:tc>
+          <w:tcPr>
+            <w:tcW w:type="dxa" w:w="2304"/>
+            <w:shd w:fill="FFFFFF"/>
+            <w:tcMar>
+              <w:top w:w="90" w:type="dxa"/>
+              <w:bottom w:w="90" w:type="dxa"/>
+              <w:left w:w="120" w:type="dxa"/>
+              <w:right w:w="120" w:type="dxa"/>
+            </w:tcMar>
+          </w:tcPr>
+          <w:p>
+            <w:pPr>
+              <w:jc w:val="center"/>
+            </w:pPr>
+            <w:r>
+              <w:rPr>
+                <w:color w:val="1E293B"/>
+                <w:sz w:val="17"/>
+              </w:rPr>
+              <w:t>Bcrypt, Crypto, CORS, Body-Parser</w:t>
+            </w:r>
+          </w:p>
+        </w:tc>
+        <w:tc>
+          <w:tcPr>
+            <w:tcW w:type="dxa" w:w="2304"/>
+            <w:shd w:fill="FFFFFF"/>
+            <w:tcMar>
+              <w:top w:w="90" w:type="dxa"/>
+              <w:bottom w:w="90" w:type="dxa"/>
+              <w:left w:w="120" w:type="dxa"/>
+              <w:right w:w="120" w:type="dxa"/>
+            </w:tcMar>
+          </w:tcPr>
+          <w:p>
+            <w:pPr>
+              <w:jc w:val="center"/>
+            </w:pPr>
+            <w:r>
+              <w:rPr>
+                <w:color w:val="1E293B"/>
+                <w:sz w:val="17"/>
+              </w:rPr>
+              <w:t>Motor fiscal, parseo XML, autenticación y persistencia.</w:t>
+            </w:r>
+          </w:p>
+        </w:tc>
+      </w:tr>
+      <w:tr>
+        <w:tc>
+          <w:tcPr>
+            <w:tcW w:type="dxa" w:w="2160"/>
+            <w:shd w:fill="F8FAFC"/>
+            <w:tcMar>
+              <w:top w:w="90" w:type="dxa"/>
+              <w:bottom w:w="90" w:type="dxa"/>
+              <w:left w:w="120" w:type="dxa"/>
+              <w:right w:w="120" w:type="dxa"/>
+            </w:tcMar>
+          </w:tcPr>
+          <w:p>
+            <w:pPr>
+              <w:jc w:val="left"/>
+            </w:pPr>
+            <w:r>
+              <w:rPr>
+                <w:color w:val="1E293B"/>
+                <w:sz w:val="17"/>
+              </w:rPr>
+              <w:t>Frontend Web</w:t>
+            </w:r>
+          </w:p>
+        </w:tc>
+        <w:tc>
+          <w:tcPr>
+            <w:tcW w:type="dxa" w:w="2592"/>
+            <w:shd w:fill="F8FAFC"/>
+            <w:tcMar>
+              <w:top w:w="90" w:type="dxa"/>
+              <w:bottom w:w="90" w:type="dxa"/>
+              <w:left w:w="120" w:type="dxa"/>
+              <w:right w:w="120" w:type="dxa"/>
+            </w:tcMar>
+          </w:tcPr>
+          <w:p>
+            <w:pPr>
+              <w:jc w:val="left"/>
+            </w:pPr>
+            <w:r>
+              <w:rPr>
+                <w:color w:val="1E293B"/>
+                <w:sz w:val="17"/>
+              </w:rPr>
+              <w:t>Vanilla JS ES6+ (SPA)</w:t>
+            </w:r>
+          </w:p>
+        </w:tc>
+        <w:tc>
+          <w:tcPr>
+            <w:tcW w:type="dxa" w:w="2304"/>
+            <w:shd w:fill="F8FAFC"/>
+            <w:tcMar>
+              <w:top w:w="90" w:type="dxa"/>
+              <w:bottom w:w="90" w:type="dxa"/>
+              <w:left w:w="120" w:type="dxa"/>
+              <w:right w:w="120" w:type="dxa"/>
+            </w:tcMar>
+          </w:tcPr>
+          <w:p>
+            <w:pPr>
+              <w:jc w:val="center"/>
+            </w:pPr>
+            <w:r>
+              <w:rPr>
+                <w:color w:val="1E293B"/>
+                <w:sz w:val="17"/>
+              </w:rPr>
+              <w:t>TailwindCSS 3.4, FontAwesome 6.5.1</w:t>
+            </w:r>
+          </w:p>
+        </w:tc>
+        <w:tc>
+          <w:tcPr>
+            <w:tcW w:type="dxa" w:w="2304"/>
+            <w:shd w:fill="F8FAFC"/>
+            <w:tcMar>
+              <w:top w:w="90" w:type="dxa"/>
+              <w:bottom w:w="90" w:type="dxa"/>
+              <w:left w:w="120" w:type="dxa"/>
+              <w:right w:w="120" w:type="dxa"/>
+            </w:tcMar>
+          </w:tcPr>
+          <w:p>
+            <w:pPr>
+              <w:jc w:val="center"/>
+            </w:pPr>
+            <w:r>
+              <w:rPr>
+                <w:color w:val="1E293B"/>
+                <w:sz w:val="17"/>
+              </w:rPr>
+              <w:t>Portal responsivo con polling en vivo y diseño corporativo.</w:t>
+            </w:r>
+          </w:p>
+        </w:tc>
+      </w:tr>
+      <w:tr>
+        <w:tc>
+          <w:tcPr>
+            <w:tcW w:type="dxa" w:w="2160"/>
+            <w:shd w:fill="FFFFFF"/>
+            <w:tcMar>
+              <w:top w:w="90" w:type="dxa"/>
+              <w:bottom w:w="90" w:type="dxa"/>
+              <w:left w:w="120" w:type="dxa"/>
+              <w:right w:w="120" w:type="dxa"/>
+            </w:tcMar>
+          </w:tcPr>
+          <w:p>
+            <w:pPr>
+              <w:jc w:val="left"/>
+            </w:pPr>
+            <w:r>
+              <w:rPr>
+                <w:color w:val="1E293B"/>
+                <w:sz w:val="17"/>
+              </w:rPr>
+              <w:t>App Móvil Android</w:t>
+            </w:r>
+          </w:p>
+        </w:tc>
+        <w:tc>
+          <w:tcPr>
+            <w:tcW w:type="dxa" w:w="2592"/>
+            <w:shd w:fill="FFFFFF"/>
+            <w:tcMar>
+              <w:top w:w="90" w:type="dxa"/>
+              <w:bottom w:w="90" w:type="dxa"/>
+              <w:left w:w="120" w:type="dxa"/>
+              <w:right w:w="120" w:type="dxa"/>
+            </w:tcMar>
+          </w:tcPr>
+          <w:p>
+            <w:pPr>
+              <w:jc w:val="left"/>
+            </w:pPr>
+            <w:r>
+              <w:rPr>
+                <w:color w:val="1E293B"/>
+                <w:sz w:val="17"/>
+              </w:rPr>
+              <w:t>Kotlin 1.9.24 / SDK 34</w:t>
+            </w:r>
+          </w:p>
+        </w:tc>
+        <w:tc>
+          <w:tcPr>
+            <w:tcW w:type="dxa" w:w="2304"/>
+            <w:shd w:fill="FFFFFF"/>
+            <w:tcMar>
+              <w:top w:w="90" w:type="dxa"/>
+              <w:bottom w:w="90" w:type="dxa"/>
+              <w:left w:w="120" w:type="dxa"/>
+              <w:right w:w="120" w:type="dxa"/>
+            </w:tcMar>
+          </w:tcPr>
+          <w:p>
+            <w:pPr>
+              <w:jc w:val="center"/>
+            </w:pPr>
+            <w:r>
+              <w:rPr>
+                <w:color w:val="1E293B"/>
+                <w:sz w:val="17"/>
+              </w:rPr>
+              <w:t>Retrofit 2.11, OkHttp3, Material 3</w:t>
+            </w:r>
+          </w:p>
+        </w:tc>
+        <w:tc>
+          <w:tcPr>
+            <w:tcW w:type="dxa" w:w="2304"/>
+            <w:shd w:fill="FFFFFF"/>
+            <w:tcMar>
+              <w:top w:w="90" w:type="dxa"/>
+              <w:bottom w:w="90" w:type="dxa"/>
+              <w:left w:w="120" w:type="dxa"/>
+              <w:right w:w="120" w:type="dxa"/>
+            </w:tcMar>
+          </w:tcPr>
+          <w:p>
+            <w:pPr>
+              <w:jc w:val="center"/>
+            </w:pPr>
+            <w:r>
+              <w:rPr>
+                <w:color w:val="1E293B"/>
+                <w:sz w:val="17"/>
+              </w:rPr>
+              <w:t>App nativa con generador CFDI 4.0 y dropzone XML.</w:t>
+            </w:r>
+          </w:p>
+        </w:tc>
+      </w:tr>
+      <w:tr>
+        <w:tc>
+          <w:tcPr>
+            <w:tcW w:type="dxa" w:w="2160"/>
+            <w:shd w:fill="F8FAFC"/>
+            <w:tcMar>
+              <w:top w:w="90" w:type="dxa"/>
+              <w:bottom w:w="90" w:type="dxa"/>
+              <w:left w:w="120" w:type="dxa"/>
+              <w:right w:w="120" w:type="dxa"/>
+            </w:tcMar>
+          </w:tcPr>
+          <w:p>
+            <w:pPr>
+              <w:jc w:val="left"/>
+            </w:pPr>
+            <w:r>
+              <w:rPr>
+                <w:color w:val="1E293B"/>
+                <w:sz w:val="17"/>
+              </w:rPr>
+              <w:t>Compilador Móvil</w:t>
+            </w:r>
+          </w:p>
+        </w:tc>
+        <w:tc>
+          <w:tcPr>
+            <w:tcW w:type="dxa" w:w="2592"/>
+            <w:shd w:fill="F8FAFC"/>
+            <w:tcMar>
+              <w:top w:w="90" w:type="dxa"/>
+              <w:bottom w:w="90" w:type="dxa"/>
+              <w:left w:w="120" w:type="dxa"/>
+              <w:right w:w="120" w:type="dxa"/>
+            </w:tcMar>
+          </w:tcPr>
+          <w:p>
+            <w:pPr>
+              <w:jc w:val="left"/>
+            </w:pPr>
+            <w:r>
+              <w:rPr>
+                <w:color w:val="1E293B"/>
+                <w:sz w:val="17"/>
+              </w:rPr>
+              <w:t>Gradle 8.9 / Java 21 OpenJDK</w:t>
+            </w:r>
+          </w:p>
+        </w:tc>
+        <w:tc>
+          <w:tcPr>
+            <w:tcW w:type="dxa" w:w="2304"/>
+            <w:shd w:fill="F8FAFC"/>
+            <w:tcMar>
+              <w:top w:w="90" w:type="dxa"/>
+              <w:bottom w:w="90" w:type="dxa"/>
+              <w:left w:w="120" w:type="dxa"/>
+              <w:right w:w="120" w:type="dxa"/>
+            </w:tcMar>
+          </w:tcPr>
+          <w:p>
+            <w:pPr>
+              <w:jc w:val="center"/>
+            </w:pPr>
+            <w:r>
+              <w:rPr>
+                <w:color w:val="1E293B"/>
+                <w:sz w:val="17"/>
+              </w:rPr>
+              <w:t>Android Jetpack ViewBinding, Coroutines</w:t>
+            </w:r>
+          </w:p>
+        </w:tc>
+        <w:tc>
+          <w:tcPr>
+            <w:tcW w:type="dxa" w:w="2304"/>
+            <w:shd w:fill="F8FAFC"/>
+            <w:tcMar>
+              <w:top w:w="90" w:type="dxa"/>
+              <w:bottom w:w="90" w:type="dxa"/>
+              <w:left w:w="120" w:type="dxa"/>
+              <w:right w:w="120" w:type="dxa"/>
+            </w:tcMar>
+          </w:tcPr>
+          <w:p>
+            <w:pPr>
+              <w:jc w:val="center"/>
+            </w:pPr>
+            <w:r>
+              <w:rPr>
+                <w:color w:val="1E293B"/>
+                <w:sz w:val="17"/>
+              </w:rPr>
+              <w:t>Generación de APK debug y release optimizado.</w:t>
+            </w:r>
+          </w:p>
+        </w:tc>
+      </w:tr>
+      <w:tr>
+        <w:tc>
+          <w:tcPr>
+            <w:tcW w:type="dxa" w:w="2160"/>
+            <w:shd w:fill="FFFFFF"/>
+            <w:tcMar>
+              <w:top w:w="90" w:type="dxa"/>
+              <w:bottom w:w="90" w:type="dxa"/>
+              <w:left w:w="120" w:type="dxa"/>
+              <w:right w:w="120" w:type="dxa"/>
+            </w:tcMar>
+          </w:tcPr>
+          <w:p>
+            <w:pPr>
+              <w:jc w:val="left"/>
+            </w:pPr>
+            <w:r>
+              <w:rPr>
+                <w:color w:val="1E293B"/>
+                <w:sz w:val="17"/>
+              </w:rPr>
+              <w:t>Infraestructura Cloud</w:t>
+            </w:r>
+          </w:p>
+        </w:tc>
+        <w:tc>
+          <w:tcPr>
+            <w:tcW w:type="dxa" w:w="2592"/>
+            <w:shd w:fill="FFFFFF"/>
+            <w:tcMar>
+              <w:top w:w="90" w:type="dxa"/>
+              <w:bottom w:w="90" w:type="dxa"/>
+              <w:left w:w="120" w:type="dxa"/>
+              <w:right w:w="120" w:type="dxa"/>
+            </w:tcMar>
+          </w:tcPr>
+          <w:p>
+            <w:pPr>
+              <w:jc w:val="left"/>
+            </w:pPr>
+            <w:r>
+              <w:rPr>
+                <w:color w:val="1E293B"/>
+                <w:sz w:val="17"/>
+              </w:rPr>
+              <w:t>Render Cloud (Web Service)</w:t>
+            </w:r>
+          </w:p>
+        </w:tc>
+        <w:tc>
+          <w:tcPr>
+            <w:tcW w:type="dxa" w:w="2304"/>
+            <w:shd w:fill="FFFFFF"/>
+            <w:tcMar>
+              <w:top w:w="90" w:type="dxa"/>
+              <w:bottom w:w="90" w:type="dxa"/>
+              <w:left w:w="120" w:type="dxa"/>
+              <w:right w:w="120" w:type="dxa"/>
+            </w:tcMar>
+          </w:tcPr>
+          <w:p>
+            <w:pPr>
+              <w:jc w:val="center"/>
+            </w:pPr>
+            <w:r>
+              <w:rPr>
+                <w:color w:val="1E293B"/>
+                <w:sz w:val="17"/>
+              </w:rPr>
+              <w:t>Git / GitHub Actions, HTTPS Let's Encrypt</w:t>
+            </w:r>
+          </w:p>
+        </w:tc>
+        <w:tc>
+          <w:tcPr>
+            <w:tcW w:type="dxa" w:w="2304"/>
+            <w:shd w:fill="FFFFFF"/>
+            <w:tcMar>
+              <w:top w:w="90" w:type="dxa"/>
+              <w:bottom w:w="90" w:type="dxa"/>
+              <w:left w:w="120" w:type="dxa"/>
+              <w:right w:w="120" w:type="dxa"/>
+            </w:tcMar>
+          </w:tcPr>
+          <w:p>
+            <w:pPr>
+              <w:jc w:val="center"/>
+            </w:pPr>
+            <w:r>
+              <w:rPr>
+                <w:color w:val="1E293B"/>
+                <w:sz w:val="17"/>
+              </w:rPr>
+              <w:t>Hosting 24/7 universal con despliegue continuo.</w:t>
+            </w:r>
+          </w:p>
+        </w:tc>
+      </w:tr>
+    </w:tbl>
+    <w:p>
+      <w:pPr>
+        <w:spacing w:after="80"/>
+      </w:pPr>
+    </w:p>
+    <w:p>
+      <w:pPr>
+        <w:pStyle w:val="ListBullet"/>
+        <w:spacing w:before="0" w:after="60" w:line="276" w:lineRule="auto"/>
+      </w:pPr>
+      <w:r>
+        <w:rPr>
+          <w:b/>
+          <w:color w:val="0F172A"/>
+          <w:sz w:val="19"/>
+        </w:rPr>
+        <w:t xml:space="preserve">Rendimiento del Backend: </w:t>
+      </w:r>
+      <w:r>
+        <w:rPr>
+          <w:color w:val="334155"/>
+          <w:sz w:val="19"/>
+        </w:rPr>
+        <w:t>Node.js y Express proporcionan una arquitectura no bloqueante capaz de procesar validaciones de XML simultáneas en menos de 20 milisegundos por comprobante.</w:t>
+      </w:r>
+    </w:p>
+    <w:p>
+      <w:pPr>
+        <w:pStyle w:val="ListBullet"/>
+        <w:spacing w:before="0" w:after="60" w:line="276" w:lineRule="auto"/>
+      </w:pPr>
+      <w:r>
+        <w:rPr>
+          <w:b/>
+          <w:color w:val="0F172A"/>
+          <w:sz w:val="19"/>
+        </w:rPr>
+        <w:t xml:space="preserve">Persistencia Confiable: </w:t>
+      </w:r>
+      <w:r>
+        <w:rPr>
+          <w:color w:val="334155"/>
+          <w:sz w:val="19"/>
+        </w:rPr>
+        <w:t>Almacenamiento persistente en disco (data/comprobantes.json) con resguardo de transacciones en memoria, permitiendo tolerancia total a fallos y reinicios de servidor.</w:t>
+      </w:r>
+    </w:p>
+    <w:p>
+      <w:pPr>
+        <w:pStyle w:val="ListBullet"/>
+        <w:spacing w:before="0" w:after="60" w:line="276" w:lineRule="auto"/>
+      </w:pPr>
+      <w:r>
+        <w:rPr>
+          <w:b/>
+          <w:color w:val="0F172A"/>
+          <w:sz w:val="19"/>
+        </w:rPr>
+        <w:t xml:space="preserve">Capa de Red Android: </w:t>
+      </w:r>
+      <w:r>
+        <w:rPr>
+          <w:color w:val="334155"/>
+          <w:sz w:val="19"/>
+        </w:rPr>
+        <w:t>Retrofit 2 gestiona peticiones asíncronas con corrutinas de Kotlin en segundo plano, evitando cualquier congelamiento de la interfaz de usuario en teléfonos móviles.</w:t>
+      </w:r>
+    </w:p>
+    <w:p>
+      <w:pPr>
+        <w:pStyle w:val="Heading1"/>
+        <w:keepNext/>
+        <w:spacing w:before="280" w:after="120"/>
+      </w:pPr>
+      <w:r>
+        <w:rPr>
+          <w:b/>
+          <w:color w:val="0F4C3A"/>
+          <w:sz w:val="30"/>
+        </w:rPr>
+        <w:t>3. Catálogo Oficial de Usuarios, Roles y Credenciales</w:t>
+      </w:r>
+    </w:p>
+    <w:p>
+      <w:pPr>
+        <w:spacing w:before="0" w:after="80" w:line="276" w:lineRule="auto"/>
+      </w:pPr>
+      <w:r>
+        <w:rPr>
+          <w:color w:val="334155"/>
+          <w:sz w:val="20"/>
+        </w:rPr>
+        <w:t>El sistema cuenta con dos niveles de acceso diferenciados pero integrados armónicamente:</w:t>
       </w:r>
     </w:p>
     <w:tbl>
@@ -185,7 +886,7 @@
       <w:tr>
         <w:tc>
           <w:tcPr>
-            <w:tcW w:type="dxa" w:w="1872"/>
+            <w:tcW w:type="dxa" w:w="2016"/>
             <w:shd w:fill="0F4C3A"/>
             <w:tcMar>
               <w:top w:w="100" w:type="dxa"/>
@@ -204,7 +905,7 @@
                 <w:color w:val="FFFFFF"/>
                 <w:sz w:val="18"/>
               </w:rPr>
-              <w:t>Colaborador</w:t>
+              <w:t>Nombre del Perfil</w:t>
             </w:r>
           </w:p>
         </w:tc>
@@ -229,7 +930,7 @@
                 <w:color w:val="FFFFFF"/>
                 <w:sz w:val="18"/>
               </w:rPr>
-              <w:t>Puesto / Área</w:t>
+              <w:t>Puesto Asignado</w:t>
             </w:r>
           </w:p>
         </w:tc>
@@ -279,7 +980,7 @@
                 <w:color w:val="FFFFFF"/>
                 <w:sz w:val="18"/>
               </w:rPr>
-              <w:t>Destino</w:t>
+              <w:t>Destino / Sede</w:t>
             </w:r>
           </w:p>
         </w:tc>
@@ -310,7 +1011,7 @@
         </w:tc>
         <w:tc>
           <w:tcPr>
-            <w:tcW w:type="dxa" w:w="1296"/>
+            <w:tcW w:type="dxa" w:w="1152"/>
             <w:shd w:fill="0F4C3A"/>
             <w:tcMar>
               <w:top w:w="100" w:type="dxa"/>
@@ -329,7 +1030,7 @@
                 <w:color w:val="FFFFFF"/>
                 <w:sz w:val="18"/>
               </w:rPr>
-              <w:t>Clave Única</w:t>
+              <w:t>Clave / Contraseña</w:t>
             </w:r>
           </w:p>
         </w:tc>
@@ -337,7 +1038,7 @@
       <w:tr>
         <w:tc>
           <w:tcPr>
-            <w:tcW w:type="dxa" w:w="1872"/>
+            <w:tcW w:type="dxa" w:w="2016"/>
             <w:shd w:fill="FFFFFF"/>
             <w:tcMar>
               <w:top w:w="90" w:type="dxa"/>
@@ -372,7 +1073,7 @@
           </w:tcPr>
           <w:p>
             <w:pPr>
-              <w:jc w:val="center"/>
+              <w:jc w:val="left"/>
             </w:pPr>
             <w:r>
               <w:rPr>
@@ -420,7 +1121,7 @@
           </w:tcPr>
           <w:p>
             <w:pPr>
-              <w:jc w:val="left"/>
+              <w:jc w:val="center"/>
             </w:pPr>
             <w:r>
               <w:rPr>
@@ -457,7 +1158,7 @@
         </w:tc>
         <w:tc>
           <w:tcPr>
-            <w:tcW w:type="dxa" w:w="1296"/>
+            <w:tcW w:type="dxa" w:w="1152"/>
             <w:shd w:fill="FFFFFF"/>
             <w:tcMar>
               <w:top w:w="90" w:type="dxa"/>
@@ -483,7 +1184,7 @@
       <w:tr>
         <w:tc>
           <w:tcPr>
-            <w:tcW w:type="dxa" w:w="1872"/>
+            <w:tcW w:type="dxa" w:w="2016"/>
             <w:shd w:fill="F8FAFC"/>
             <w:tcMar>
               <w:top w:w="90" w:type="dxa"/>
@@ -501,7 +1202,7 @@
                 <w:color w:val="1E293B"/>
                 <w:sz w:val="17"/>
               </w:rPr>
-              <w:t>Sandra Urquilla Delgado</w:t>
+              <w:t>Sandra Urquilla Rosales</w:t>
             </w:r>
           </w:p>
         </w:tc>
@@ -518,7 +1219,7 @@
           </w:tcPr>
           <w:p>
             <w:pPr>
-              <w:jc w:val="center"/>
+              <w:jc w:val="left"/>
             </w:pPr>
             <w:r>
               <w:rPr>
@@ -549,7 +1250,7 @@
                 <w:color w:val="1E293B"/>
                 <w:sz w:val="17"/>
               </w:rPr>
-              <w:t>URDS9204058K2</w:t>
+              <w:t>UROS920318M14</w:t>
             </w:r>
           </w:p>
         </w:tc>
@@ -566,7 +1267,7 @@
           </w:tcPr>
           <w:p>
             <w:pPr>
-              <w:jc w:val="left"/>
+              <w:jc w:val="center"/>
             </w:pPr>
             <w:r>
               <w:rPr>
@@ -603,7 +1304,7 @@
         </w:tc>
         <w:tc>
           <w:tcPr>
-            <w:tcW w:type="dxa" w:w="1296"/>
+            <w:tcW w:type="dxa" w:w="1152"/>
             <w:shd w:fill="F8FAFC"/>
             <w:tcMar>
               <w:top w:w="90" w:type="dxa"/>
@@ -621,7 +1322,7 @@
                 <w:color w:val="1E293B"/>
                 <w:sz w:val="17"/>
               </w:rPr>
-              <w:t>SUD-2026</w:t>
+              <w:t>SUR-2026</w:t>
             </w:r>
           </w:p>
         </w:tc>
@@ -629,7 +1330,7 @@
       <w:tr>
         <w:tc>
           <w:tcPr>
-            <w:tcW w:type="dxa" w:w="1872"/>
+            <w:tcW w:type="dxa" w:w="2016"/>
             <w:shd w:fill="FFFFFF"/>
             <w:tcMar>
               <w:top w:w="90" w:type="dxa"/>
@@ -647,7 +1348,7 @@
                 <w:color w:val="1E293B"/>
                 <w:sz w:val="17"/>
               </w:rPr>
-              <w:t>Ángel Miramontes Castro</w:t>
+              <w:t>Ángel Miramontes</w:t>
             </w:r>
           </w:p>
         </w:tc>
@@ -664,14 +1365,14 @@
           </w:tcPr>
           <w:p>
             <w:pPr>
-              <w:jc w:val="center"/>
+              <w:jc w:val="left"/>
             </w:pPr>
             <w:r>
               <w:rPr>
                 <w:color w:val="1E293B"/>
                 <w:sz w:val="17"/>
               </w:rPr>
-              <w:t>Supervisor Técnico</w:t>
+              <w:t>Auditor Contable Senior</w:t>
             </w:r>
           </w:p>
         </w:tc>
@@ -695,7 +1396,7 @@
                 <w:color w:val="1E293B"/>
                 <w:sz w:val="17"/>
               </w:rPr>
-              <w:t>MICA851120PX9</w:t>
+              <w:t>MIRA851120AB9</w:t>
             </w:r>
           </w:p>
         </w:tc>
@@ -712,14 +1413,14 @@
           </w:tcPr>
           <w:p>
             <w:pPr>
-              <w:jc w:val="left"/>
+              <w:jc w:val="center"/>
             </w:pPr>
             <w:r>
               <w:rPr>
                 <w:color w:val="1E293B"/>
                 <w:sz w:val="17"/>
               </w:rPr>
-              <w:t>Tijuana, BC</w:t>
+              <w:t>Cancún, Q. ROO</w:t>
             </w:r>
           </w:p>
         </w:tc>
@@ -743,13 +1444,13 @@
                 <w:color w:val="1E293B"/>
                 <w:sz w:val="17"/>
               </w:rPr>
-              <w:t>$4,500.00</w:t>
+              <w:t>$12,000.00</w:t>
             </w:r>
           </w:p>
         </w:tc>
         <w:tc>
           <w:tcPr>
-            <w:tcW w:type="dxa" w:w="1296"/>
+            <w:tcW w:type="dxa" w:w="1152"/>
             <w:shd w:fill="FFFFFF"/>
             <w:tcMar>
               <w:top w:w="90" w:type="dxa"/>
@@ -767,7 +1468,7 @@
                 <w:color w:val="1E293B"/>
                 <w:sz w:val="17"/>
               </w:rPr>
-              <w:t>AMC-2026</w:t>
+              <w:t>AM-2026</w:t>
             </w:r>
           </w:p>
         </w:tc>
@@ -775,7 +1476,7 @@
       <w:tr>
         <w:tc>
           <w:tcPr>
-            <w:tcW w:type="dxa" w:w="1872"/>
+            <w:tcW w:type="dxa" w:w="2016"/>
             <w:shd w:fill="F8FAFC"/>
             <w:tcMar>
               <w:top w:w="90" w:type="dxa"/>
@@ -793,7 +1494,7 @@
                 <w:color w:val="1E293B"/>
                 <w:sz w:val="17"/>
               </w:rPr>
-              <w:t>Sofia Cristina Navarro Ruiz</w:t>
+              <w:t>Jorge Luis Lopez</w:t>
             </w:r>
           </w:p>
         </w:tc>
@@ -810,14 +1511,14 @@
           </w:tcPr>
           <w:p>
             <w:pPr>
-              <w:jc w:val="center"/>
+              <w:jc w:val="left"/>
             </w:pPr>
             <w:r>
               <w:rPr>
                 <w:color w:val="1E293B"/>
                 <w:sz w:val="17"/>
               </w:rPr>
-              <w:t>Coordinadora Proyectos</w:t>
+              <w:t>Coordinador de TI</w:t>
             </w:r>
           </w:p>
         </w:tc>
@@ -841,7 +1542,7 @@
                 <w:color w:val="1E293B"/>
                 <w:sz w:val="17"/>
               </w:rPr>
-              <w:t>NARS900101XYZ</w:t>
+              <w:t>LOGJ010405V78</w:t>
             </w:r>
           </w:p>
         </w:tc>
@@ -858,7 +1559,7 @@
           </w:tcPr>
           <w:p>
             <w:pPr>
-              <w:jc w:val="left"/>
+              <w:jc w:val="center"/>
             </w:pPr>
             <w:r>
               <w:rPr>
@@ -895,7 +1596,7 @@
         </w:tc>
         <w:tc>
           <w:tcPr>
-            <w:tcW w:type="dxa" w:w="1296"/>
+            <w:tcW w:type="dxa" w:w="1152"/>
             <w:shd w:fill="F8FAFC"/>
             <w:tcMar>
               <w:top w:w="90" w:type="dxa"/>
@@ -913,7 +1614,153 @@
                 <w:color w:val="1E293B"/>
                 <w:sz w:val="17"/>
               </w:rPr>
-              <w:t>SCNR-2026</w:t>
+              <w:t>JLL-2026</w:t>
+            </w:r>
+          </w:p>
+        </w:tc>
+      </w:tr>
+      <w:tr>
+        <w:tc>
+          <w:tcPr>
+            <w:tcW w:type="dxa" w:w="2016"/>
+            <w:shd w:fill="FFFFFF"/>
+            <w:tcMar>
+              <w:top w:w="90" w:type="dxa"/>
+              <w:bottom w:w="90" w:type="dxa"/>
+              <w:left w:w="120" w:type="dxa"/>
+              <w:right w:w="120" w:type="dxa"/>
+            </w:tcMar>
+          </w:tcPr>
+          <w:p>
+            <w:pPr>
+              <w:jc w:val="left"/>
+            </w:pPr>
+            <w:r>
+              <w:rPr>
+                <w:color w:val="1E293B"/>
+                <w:sz w:val="17"/>
+              </w:rPr>
+              <w:t>Damian Spears</w:t>
+            </w:r>
+          </w:p>
+        </w:tc>
+        <w:tc>
+          <w:tcPr>
+            <w:tcW w:type="dxa" w:w="1728"/>
+            <w:shd w:fill="FFFFFF"/>
+            <w:tcMar>
+              <w:top w:w="90" w:type="dxa"/>
+              <w:bottom w:w="90" w:type="dxa"/>
+              <w:left w:w="120" w:type="dxa"/>
+              <w:right w:w="120" w:type="dxa"/>
+            </w:tcMar>
+          </w:tcPr>
+          <w:p>
+            <w:pPr>
+              <w:jc w:val="left"/>
+            </w:pPr>
+            <w:r>
+              <w:rPr>
+                <w:color w:val="1E293B"/>
+                <w:sz w:val="17"/>
+              </w:rPr>
+              <w:t>Dirección General (Admin)</w:t>
+            </w:r>
+          </w:p>
+        </w:tc>
+        <w:tc>
+          <w:tcPr>
+            <w:tcW w:type="dxa" w:w="1584"/>
+            <w:shd w:fill="FFFFFF"/>
+            <w:tcMar>
+              <w:top w:w="90" w:type="dxa"/>
+              <w:bottom w:w="90" w:type="dxa"/>
+              <w:left w:w="120" w:type="dxa"/>
+              <w:right w:w="120" w:type="dxa"/>
+            </w:tcMar>
+          </w:tcPr>
+          <w:p>
+            <w:pPr>
+              <w:jc w:val="center"/>
+            </w:pPr>
+            <w:r>
+              <w:rPr>
+                <w:color w:val="1E293B"/>
+                <w:sz w:val="17"/>
+              </w:rPr>
+              <w:t>SPED850312XX1</w:t>
+            </w:r>
+          </w:p>
+        </w:tc>
+        <w:tc>
+          <w:tcPr>
+            <w:tcW w:type="dxa" w:w="1584"/>
+            <w:shd w:fill="FFFFFF"/>
+            <w:tcMar>
+              <w:top w:w="90" w:type="dxa"/>
+              <w:bottom w:w="90" w:type="dxa"/>
+              <w:left w:w="120" w:type="dxa"/>
+              <w:right w:w="120" w:type="dxa"/>
+            </w:tcMar>
+          </w:tcPr>
+          <w:p>
+            <w:pPr>
+              <w:jc w:val="center"/>
+            </w:pPr>
+            <w:r>
+              <w:rPr>
+                <w:color w:val="1E293B"/>
+                <w:sz w:val="17"/>
+              </w:rPr>
+              <w:t>Corporativo Central</w:t>
+            </w:r>
+          </w:p>
+        </w:tc>
+        <w:tc>
+          <w:tcPr>
+            <w:tcW w:type="dxa" w:w="1296"/>
+            <w:shd w:fill="FFFFFF"/>
+            <w:tcMar>
+              <w:top w:w="90" w:type="dxa"/>
+              <w:bottom w:w="90" w:type="dxa"/>
+              <w:left w:w="120" w:type="dxa"/>
+              <w:right w:w="120" w:type="dxa"/>
+            </w:tcMar>
+          </w:tcPr>
+          <w:p>
+            <w:pPr>
+              <w:jc w:val="center"/>
+            </w:pPr>
+            <w:r>
+              <w:rPr>
+                <w:color w:val="1E293B"/>
+                <w:sz w:val="17"/>
+              </w:rPr>
+              <w:t>Ilimitado</w:t>
+            </w:r>
+          </w:p>
+        </w:tc>
+        <w:tc>
+          <w:tcPr>
+            <w:tcW w:type="dxa" w:w="1152"/>
+            <w:shd w:fill="FFFFFF"/>
+            <w:tcMar>
+              <w:top w:w="90" w:type="dxa"/>
+              <w:bottom w:w="90" w:type="dxa"/>
+              <w:left w:w="120" w:type="dxa"/>
+              <w:right w:w="120" w:type="dxa"/>
+            </w:tcMar>
+          </w:tcPr>
+          <w:p>
+            <w:pPr>
+              <w:jc w:val="center"/>
+            </w:pPr>
+            <w:r>
+              <w:rPr>
+                <w:color w:val="1E293B"/>
+                <w:sz w:val="17"/>
+              </w:rPr>
+              <w:t>Papaleta723!</w:t>
             </w:r>
           </w:p>
         </w:tc>
@@ -962,7 +1809,7 @@
                 <w:color w:val="0F4C3A"/>
                 <w:sz w:val="20"/>
               </w:rPr>
-              <w:t>Credenciales Maestras del Administrador</w:t>
+              <w:t>🔐 Acceso Unificado y Discreto del Administrador en la Web</w:t>
               <w:br/>
             </w:r>
             <w:r>
@@ -970,11 +1817,7 @@
                 <w:color w:val="334155"/>
                 <w:sz w:val="19"/>
               </w:rPr>
-              <w:t>• Usuario Maestro: DamianSpears_Owner</w:t>
-              <w:br/>
-              <w:t>• Contraseña de Acceso: Papaleta723!</w:t>
-              <w:br/>
-              <w:t>• Rol: Propietario / Auditor Máximo con facultades para dar de alta colaboradores, auditar movimientos y autorizar o rechazar facturas fiscales.</w:t>
+              <w:t>A solicitud de la dirección corporativa, se ha eliminado cualquier tarjeta o botón externo de 'Acceso Administrador' en la página de inicio. El perfil de 'Damian Spears — Dirección General' se encuentra integrado de forma completamente natural en el selector de colaboradores. Al seleccionarlo y escribir la contraseña maestra ('Papaleta723!'), el portal reconoce internamente sus permisos y desbloquea el Módulo de Administración sin llamar la atención de personal no autorizado.</w:t>
             </w:r>
           </w:p>
         </w:tc>
@@ -997,7 +1840,7 @@
           <w:color w:val="0F4C3A"/>
           <w:sz w:val="30"/>
         </w:rPr>
-        <w:t>3. Módulo Administrador: Auditoría Fiscal y Dictamen de Facturas</w:t>
+        <w:t>4. Generador Directo de Facturas CFDI 4.0 y Validación SAT</w:t>
       </w:r>
     </w:p>
     <w:p>
@@ -1009,34 +1852,7 @@
           <w:color w:val="334155"/>
           <w:sz w:val="20"/>
         </w:rPr>
-        <w:t>Tanto en la aplicación Android como en el portal Web, el Administrador dispone de un panel exclusivo para inspeccionar las comprobaciones de cada perfil y dictaminar sus facturas:</w:t>
-      </w:r>
-    </w:p>
-    <w:p>
-      <w:pPr>
-        <w:pStyle w:val="Heading2"/>
-        <w:keepNext/>
-        <w:spacing w:before="280" w:after="120"/>
-      </w:pPr>
-      <w:r>
-        <w:rPr>
-          <w:b/>
-          <w:color w:val="1E40AF"/>
-          <w:sz w:val="24"/>
-        </w:rPr>
-        <w:t>3.1 Inspección Individual de Movimientos</w:t>
-      </w:r>
-    </w:p>
-    <w:p>
-      <w:pPr>
-        <w:spacing w:before="0" w:after="80" w:line="276" w:lineRule="auto"/>
-      </w:pPr>
-      <w:r>
-        <w:rPr>
-          <w:color w:val="334155"/>
-          <w:sz w:val="20"/>
-        </w:rPr>
-        <w:t>Al presionar el botón 'Movimientos' (Web) o '🔍 Ver Movimientos y Facturas' (Android), se despliega una ficha financiera detallada que contiene:</w:t>
+        <w:t>Una de las mayores innovaciones de la versión 3.0.0 es la inclusión de un Generador y Emisor Digital de Facturas CFDI 4.0 directamente dentro de la aplicación móvil de Android:</w:t>
       </w:r>
     </w:p>
     <w:p>
@@ -1049,14 +1865,14 @@
           <w:color w:val="0F172A"/>
           <w:sz w:val="20"/>
         </w:rPr>
-        <w:t xml:space="preserve">1. Perfil del Colaborador: </w:t>
+        <w:t xml:space="preserve">4.1 Dos Modos de Comprobación: </w:t>
       </w:r>
       <w:r>
         <w:rPr>
           <w:color w:val="334155"/>
           <w:sz w:val="20"/>
         </w:rPr>
-        <w:t>Nombre, puesto, departamento, RFC fiscal y clave confidencial asignada.</w:t>
+        <w:t>El usuario puede alternar entre '⚡ Generar Factura Directa' y '📂 Cargar Archivo XML'. Si no cuenta con el archivo XML en su almacenamiento, puede llenar los campos y timbrar la factura digital al vuelo.</w:t>
       </w:r>
     </w:p>
     <w:p>
@@ -1069,14 +1885,161 @@
           <w:color w:val="0F172A"/>
           <w:sz w:val="20"/>
         </w:rPr>
-        <w:t xml:space="preserve">2. Detalles de la Comisión: </w:t>
+        <w:t xml:space="preserve">4.2 Campos Requeridos: </w:t>
       </w:r>
       <w:r>
         <w:rPr>
           <w:color w:val="334155"/>
           <w:sz w:val="20"/>
         </w:rPr>
-        <w:t>Destino de viaje autorizado, folio de comisión y período.</w:t>
+        <w:t>El generador incluye todos los parámetros indispensables requeridos por la legislación fiscal mexicana:</w:t>
+      </w:r>
+    </w:p>
+    <w:p>
+      <w:pPr>
+        <w:pStyle w:val="ListBullet"/>
+        <w:spacing w:before="0" w:after="60" w:line="276" w:lineRule="auto"/>
+      </w:pPr>
+      <w:r>
+        <w:rPr>
+          <w:b/>
+          <w:color w:val="0F172A"/>
+          <w:sz w:val="19"/>
+        </w:rPr>
+        <w:t xml:space="preserve">1. Proveedor / Razón Social: </w:t>
+      </w:r>
+      <w:r>
+        <w:rPr>
+          <w:color w:val="334155"/>
+          <w:sz w:val="19"/>
+        </w:rPr>
+        <w:t>Nombre legal del proveedor comercial (ej. Restaurante El Portón, City Express).</w:t>
+      </w:r>
+    </w:p>
+    <w:p>
+      <w:pPr>
+        <w:pStyle w:val="ListBullet"/>
+        <w:spacing w:before="0" w:after="60" w:line="276" w:lineRule="auto"/>
+      </w:pPr>
+      <w:r>
+        <w:rPr>
+          <w:b/>
+          <w:color w:val="0F172A"/>
+          <w:sz w:val="19"/>
+        </w:rPr>
+        <w:t xml:space="preserve">2. RFC del Emisor: </w:t>
+      </w:r>
+      <w:r>
+        <w:rPr>
+          <w:color w:val="334155"/>
+          <w:sz w:val="19"/>
+        </w:rPr>
+        <w:t>Identificador fiscal a 12 o 13 caracteres con validación de estructura.</w:t>
+      </w:r>
+    </w:p>
+    <w:p>
+      <w:pPr>
+        <w:pStyle w:val="ListBullet"/>
+        <w:spacing w:before="0" w:after="60" w:line="276" w:lineRule="auto"/>
+      </w:pPr>
+      <w:r>
+        <w:rPr>
+          <w:b/>
+          <w:color w:val="0F172A"/>
+          <w:sz w:val="19"/>
+        </w:rPr>
+        <w:t xml:space="preserve">3. Folio Fiscal: </w:t>
+      </w:r>
+      <w:r>
+        <w:rPr>
+          <w:color w:val="334155"/>
+          <w:sz w:val="19"/>
+        </w:rPr>
+        <w:t>Número de serie o folio asignado a la nota o comprobante de compra.</w:t>
+      </w:r>
+    </w:p>
+    <w:p>
+      <w:pPr>
+        <w:pStyle w:val="ListBullet"/>
+        <w:spacing w:before="0" w:after="60" w:line="276" w:lineRule="auto"/>
+      </w:pPr>
+      <w:r>
+        <w:rPr>
+          <w:b/>
+          <w:color w:val="0F172A"/>
+          <w:sz w:val="19"/>
+        </w:rPr>
+        <w:t xml:space="preserve">4. Concepto del Gasto: </w:t>
+      </w:r>
+      <w:r>
+        <w:rPr>
+          <w:color w:val="334155"/>
+          <w:sz w:val="19"/>
+        </w:rPr>
+        <w:t>Descripción detallada del consumo o servicio contratado en la comisión.</w:t>
+      </w:r>
+    </w:p>
+    <w:p>
+      <w:pPr>
+        <w:pStyle w:val="ListBullet"/>
+        <w:spacing w:before="0" w:after="60" w:line="276" w:lineRule="auto"/>
+      </w:pPr>
+      <w:r>
+        <w:rPr>
+          <w:b/>
+          <w:color w:val="0F172A"/>
+          <w:sz w:val="19"/>
+        </w:rPr>
+        <w:t xml:space="preserve">5. Monto Total ($ MXN): </w:t>
+      </w:r>
+      <w:r>
+        <w:rPr>
+          <w:color w:val="334155"/>
+          <w:sz w:val="19"/>
+        </w:rPr>
+        <w:t>Importe final pagado en Moneda Nacional. El generador calcula automáticamente la Base imponible y el IVA al 16%.</w:t>
+      </w:r>
+    </w:p>
+    <w:p>
+      <w:pPr>
+        <w:pStyle w:val="ListBullet"/>
+        <w:spacing w:before="0" w:after="60" w:line="276" w:lineRule="auto"/>
+      </w:pPr>
+      <w:r>
+        <w:rPr>
+          <w:b/>
+          <w:color w:val="0F172A"/>
+          <w:sz w:val="19"/>
+        </w:rPr>
+        <w:t xml:space="preserve">6. Categoría del Gasto: </w:t>
+      </w:r>
+      <w:r>
+        <w:rPr>
+          <w:color w:val="334155"/>
+          <w:sz w:val="19"/>
+        </w:rPr>
+        <w:t>Chips de selección rápida: ALIMENTOS, HOSPEDAJE, TRANSPORTE, GASOLINA u OTROS.</w:t>
+      </w:r>
+    </w:p>
+    <w:p>
+      <w:pPr>
+        <w:pStyle w:val="ListBullet"/>
+        <w:spacing w:before="0" w:after="60" w:line="276" w:lineRule="auto"/>
+      </w:pPr>
+      <w:r>
+        <w:rPr>
+          <w:b/>
+          <w:color w:val="0F172A"/>
+          <w:sz w:val="19"/>
+        </w:rPr>
+        <w:t xml:space="preserve">7. Forma de Pago SAT: </w:t>
+      </w:r>
+      <w:r>
+        <w:rPr>
+          <w:color w:val="334155"/>
+          <w:sz w:val="19"/>
+        </w:rPr>
+        <w:t>Catálogo oficial del SAT: Tarjeta de Crédito (04), Tarjeta de Débito (28), Transferencia Electrónica SPEI (03) y Efectivo (01).</w:t>
       </w:r>
     </w:p>
     <w:p>
@@ -1089,161 +2052,77 @@
           <w:color w:val="0F172A"/>
           <w:sz w:val="20"/>
         </w:rPr>
-        <w:t xml:space="preserve">3. Anticipo Asignado: </w:t>
+        <w:t xml:space="preserve">4.3 Botones de Muestras Rápidas (1-Tap Testing): </w:t>
       </w:r>
       <w:r>
         <w:rPr>
           <w:color w:val="334155"/>
           <w:sz w:val="20"/>
         </w:rPr>
-        <w:t>Presupuesto inicial entregado al trabajador bajo el concepto de viáticos.</w:t>
+        <w:t>Para facilitar demostraciones y pruebas instantáneas sin escribir, la app integra 3 botones de un toque:</w:t>
       </w:r>
     </w:p>
     <w:p>
       <w:pPr>
-        <w:spacing w:before="0" w:after="80" w:line="276" w:lineRule="auto"/>
+        <w:pStyle w:val="ListBullet"/>
+        <w:spacing w:before="0" w:after="60" w:line="276" w:lineRule="auto"/>
       </w:pPr>
       <w:r>
         <w:rPr>
           <w:b/>
           <w:color w:val="0F172A"/>
-          <w:sz w:val="20"/>
+          <w:sz w:val="19"/>
         </w:rPr>
-        <w:t xml:space="preserve">4. Total Gastado Bruto: </w:t>
+        <w:t xml:space="preserve">• Muestra 1 (Alimentos Válida): </w:t>
       </w:r>
       <w:r>
         <w:rPr>
           <w:color w:val="334155"/>
-          <w:sz w:val="20"/>
+          <w:sz w:val="19"/>
         </w:rPr>
-        <w:t>Suma total de todas las facturas electrónicas subidas.</w:t>
+        <w:t>Restaurante El Portón por $720.00 MXN. Pasa todas las reglas y se deduce al 100% al no superar el límite de $750.00 diarios.</w:t>
       </w:r>
     </w:p>
     <w:p>
       <w:pPr>
-        <w:spacing w:before="0" w:after="80" w:line="276" w:lineRule="auto"/>
+        <w:pStyle w:val="ListBullet"/>
+        <w:spacing w:before="0" w:after="60" w:line="276" w:lineRule="auto"/>
       </w:pPr>
       <w:r>
         <w:rPr>
           <w:b/>
           <w:color w:val="0F172A"/>
-          <w:sz w:val="20"/>
+          <w:sz w:val="19"/>
         </w:rPr>
-        <w:t xml:space="preserve">5. Deducible SAT: </w:t>
+        <w:t xml:space="preserve">• Muestra 2 (Hospedaje Válido): </w:t>
       </w:r>
       <w:r>
         <w:rPr>
           <w:color w:val="334155"/>
-          <w:sz w:val="20"/>
+          <w:sz w:val="19"/>
         </w:rPr>
-        <w:t>Monto validado que cumple estrictamente con el Art. 28 de la LISR.</w:t>
+        <w:t>Hoteles City Express por $986.00 MXN. Deducible íntegramente conforme a comprobación de pernocta.</w:t>
       </w:r>
     </w:p>
     <w:p>
       <w:pPr>
-        <w:spacing w:before="0" w:after="80" w:line="276" w:lineRule="auto"/>
+        <w:pStyle w:val="ListBullet"/>
+        <w:spacing w:before="0" w:after="60" w:line="276" w:lineRule="auto"/>
       </w:pPr>
       <w:r>
         <w:rPr>
           <w:b/>
           <w:color w:val="0F172A"/>
-          <w:sz w:val="20"/>
+          <w:sz w:val="19"/>
         </w:rPr>
-        <w:t xml:space="preserve">6. Saldo de Liquidación: </w:t>
+        <w:t xml:space="preserve">• Muestra 3 (Excedente en Alimentos): </w:t>
       </w:r>
       <w:r>
         <w:rPr>
           <w:color w:val="334155"/>
-          <w:sz w:val="20"/>
+          <w:sz w:val="19"/>
         </w:rPr>
-        <w:t>Diferencia neta entre el anticipo y los gastos deducibles. Si es positivo, se presenta en verde como 'Saldo por Reintegrar a la Empresa'; si es negativo, se presenta como 'Excedente a Reembolsar al Trabajador'.</w:t>
-      </w:r>
-    </w:p>
-    <w:p>
-      <w:pPr>
-        <w:pStyle w:val="Heading2"/>
-        <w:keepNext/>
-        <w:spacing w:before="280" w:after="120"/>
-      </w:pPr>
-      <w:r>
-        <w:rPr>
-          <w:b/>
-          <w:color w:val="1E40AF"/>
-          <w:sz w:val="24"/>
-        </w:rPr>
-        <w:t>3.2 Mecanismo de Aceptación y Rechazo de Facturas</w:t>
-      </w:r>
-    </w:p>
-    <w:p>
-      <w:pPr>
-        <w:spacing w:before="0" w:after="80" w:line="276" w:lineRule="auto"/>
-      </w:pPr>
-      <w:r>
-        <w:rPr>
-          <w:color w:val="334155"/>
-          <w:sz w:val="20"/>
-        </w:rPr>
-        <w:t>El administrador puede dictaminar individualmente cada comprobante CFDI 4.0 cargado por el trabajador:</w:t>
-      </w:r>
-    </w:p>
-    <w:p>
-      <w:pPr>
-        <w:spacing w:before="0" w:after="80" w:line="276" w:lineRule="auto"/>
-      </w:pPr>
-      <w:r>
-        <w:rPr>
-          <w:b/>
-          <w:color w:val="0F172A"/>
-          <w:sz w:val="20"/>
-        </w:rPr>
-        <w:t xml:space="preserve">• Acción ACEPTAR (✓): </w:t>
-      </w:r>
-      <w:r>
-        <w:rPr>
-          <w:color w:val="334155"/>
-          <w:sz w:val="20"/>
-        </w:rPr>
-        <w:t>Confirma la validez fiscal y administrativa del gasto. La factura se marca como '✅ APROBADA' y su importe deducible se suma a favor del saldo de la liquidación.</w:t>
-      </w:r>
-    </w:p>
-    <w:p>
-      <w:pPr>
-        <w:spacing w:before="0" w:after="80" w:line="276" w:lineRule="auto"/>
-      </w:pPr>
-      <w:r>
-        <w:rPr>
-          <w:b/>
-          <w:color w:val="0F172A"/>
-          <w:sz w:val="20"/>
-        </w:rPr>
-        <w:t xml:space="preserve">• Acción RECHAZAR (✕): </w:t>
-      </w:r>
-      <w:r>
-        <w:rPr>
-          <w:color w:val="334155"/>
-          <w:sz w:val="20"/>
-        </w:rPr>
-        <w:t>El administrador marca la factura como '✕ RECHAZADA'. En ese mismo instante, el sistema excluye la factura del cálculo deducible (monto deducible = $0.00), trasladando el importe total a gasto no deducible y aumentando inmediatamente el saldo que el empleado debe devolver a la empresa.</w:t>
-      </w:r>
-    </w:p>
-    <w:p>
-      <w:pPr>
-        <w:spacing w:before="0" w:after="80" w:line="276" w:lineRule="auto"/>
-      </w:pPr>
-      <w:r>
-        <w:rPr>
-          <w:b/>
-          <w:color w:val="0F172A"/>
-          <w:sz w:val="20"/>
-        </w:rPr>
-        <w:t xml:space="preserve">• Persistencia e Inmutabilidad: </w:t>
-      </w:r>
-      <w:r>
-        <w:rPr>
-          <w:color w:val="334155"/>
-          <w:sz w:val="20"/>
-        </w:rPr>
-        <w:t>Cualquier decisión tomada por el administrador se persiste en disco en comprobantes.json y se notifica al colaborador en su panel en tiempo real.</w:t>
+        <w:t>Steak House Capital por $1,300.00 MXN. Demuestra el cálculo automático del Art. 28 LISR: autoriza $750.00 como deducible y traslada $550.00 a Excedente No Deducible.</w:t>
       </w:r>
     </w:p>
     <w:p>
@@ -1258,7 +2137,7 @@
           <w:color w:val="0F4C3A"/>
           <w:sz w:val="30"/>
         </w:rPr>
-        <w:t>4. Aplicación Móvil Android (ViaticosAndroidApp)</w:t>
+        <w:t>5. Módulo de Administración, Altas y Auditoría Fiscal</w:t>
       </w:r>
     </w:p>
     <w:p>
@@ -1270,22 +2149,7 @@
           <w:color w:val="334155"/>
           <w:sz w:val="20"/>
         </w:rPr>
-        <w:t>La aplicación Android fue desarrollada en Kotlin nativo para brindar el máximo rendimiento, seguridad biométrica y compatibilidad con dispositivos modernos:</w:t>
-      </w:r>
-    </w:p>
-    <w:p>
-      <w:pPr>
-        <w:pStyle w:val="Heading2"/>
-        <w:keepNext/>
-        <w:spacing w:before="280" w:after="120"/>
-      </w:pPr>
-      <w:r>
-        <w:rPr>
-          <w:b/>
-          <w:color w:val="1E40AF"/>
-          <w:sz w:val="24"/>
-        </w:rPr>
-        <w:t>4.1 Características de la Aplicación Móvil</w:t>
+        <w:t>El panel de administración permite supervisar el gasto de toda la plantilla y modificar parámetros en vivo:</w:t>
       </w:r>
     </w:p>
     <w:p>
@@ -1298,14 +2162,14 @@
           <w:color w:val="0F172A"/>
           <w:sz w:val="20"/>
         </w:rPr>
-        <w:t xml:space="preserve">• Acceso Seguro y Estético: </w:t>
+        <w:t xml:space="preserve">5.1 Alta de Nuevos Colaboradores: </w:t>
       </w:r>
       <w:r>
         <w:rPr>
           <w:color w:val="334155"/>
           <w:sz w:val="20"/>
         </w:rPr>
-        <w:t>Toda la interfaz visual de inicio solicita primero elegir el perfil de usuario mediante una tarjeta táctil estilizada con gradientes y avatares dinámicos. Ningún saldo o dato sensible es visible antes de validar la clave.</w:t>
+        <w:t>Permite incorporar colaboradores comisionados registrando 12 campos obligatorios: Nombre Completo, RFC Fiscal, Correo Corporativo, Puesto, Departamento, Clave Única generada, Estatus, Destino del Viaje, Motivo de la Comisión, Fecha de Inicio, Fecha de Fin y Anticipo Otorgado.</w:t>
       </w:r>
     </w:p>
     <w:p>
@@ -1318,14 +2182,14 @@
           <w:color w:val="0F172A"/>
           <w:sz w:val="20"/>
         </w:rPr>
-        <w:t xml:space="preserve">• Teclado Alfanumérico: </w:t>
+        <w:t xml:space="preserve">5.2 Edición de Colaboradores Existentes: </w:t>
       </w:r>
       <w:r>
         <w:rPr>
           <w:color w:val="334155"/>
           <w:sz w:val="20"/>
         </w:rPr>
-        <w:t>El campo de contraseña utiliza el teclado alfanumérico completo ('textPassword'), permitiendo ingresar contraseñas seguras con letras, números y símbolos.</w:t>
+        <w:t>Cada tarjeta de colaborador cuenta con un botón '✏️ Editar' que abre un formulario prellenado para actualizar cualquiera de los 12 datos en tiempo real mediante el endpoint PUT /api/admin/usuarios/:id.</w:t>
       </w:r>
     </w:p>
     <w:p>
@@ -1338,715 +2202,14 @@
           <w:color w:val="0F172A"/>
           <w:sz w:val="20"/>
         </w:rPr>
-        <w:t xml:space="preserve">• Carga Local de XML: </w:t>
+        <w:t xml:space="preserve">5.3 Dictamen de Facturas con Motivo: </w:t>
       </w:r>
       <w:r>
         <w:rPr>
           <w:color w:val="334155"/>
           <w:sz w:val="20"/>
         </w:rPr>
-        <w:t>Soporta carga directa de archivos .XML del CFDI 4.0 almacenados en el celular o recibidos por correo electrónico o WhatsApp.</w:t>
-      </w:r>
-    </w:p>
-    <w:p>
-      <w:pPr>
-        <w:spacing w:before="0" w:after="80" w:line="276" w:lineRule="auto"/>
-      </w:pPr>
-      <w:r>
-        <w:rPr>
-          <w:b/>
-          <w:color w:val="0F172A"/>
-          <w:sz w:val="20"/>
-        </w:rPr>
-        <w:t xml:space="preserve">• Sincronización REST: </w:t>
-      </w:r>
-      <w:r>
-        <w:rPr>
-          <w:color w:val="334155"/>
-          <w:sz w:val="20"/>
-        </w:rPr>
-        <w:t>Se conecta mediante Retrofit 2 / OkHttp3 al backend Node.js, permitiendo actualizar la IP del servidor dinámicamente desde el botón de configuración.</w:t>
-      </w:r>
-    </w:p>
-    <w:p>
-      <w:pPr>
-        <w:spacing w:before="0" w:after="80" w:line="276" w:lineRule="auto"/>
-      </w:pPr>
-      <w:r>
-        <w:rPr>
-          <w:b/>
-          <w:color w:val="0F172A"/>
-          <w:sz w:val="20"/>
-        </w:rPr>
-        <w:t xml:space="preserve">• Instalador Listo: </w:t>
-      </w:r>
-      <w:r>
-        <w:rPr>
-          <w:color w:val="334155"/>
-          <w:sz w:val="20"/>
-        </w:rPr>
-        <w:t>El paquete compilado app-debug.apk (6.6 MB) se encuentra disponible en la carpeta raíz del proyecto bajo el nombre 'JLG_Facturacion.apk'.</w:t>
-      </w:r>
-    </w:p>
-    <w:tbl>
-      <w:tblPr>
-        <w:tblW w:type="auto" w:w="0"/>
-        <w:jc w:val="center"/>
-        <w:tblLayout w:type="fixed"/>
-        <w:tblLook w:firstColumn="1" w:firstRow="1" w:lastColumn="0" w:lastRow="0" w:noHBand="0" w:noVBand="1" w:val="04A0"/>
-      </w:tblPr>
-      <w:tblGrid>
-        <w:gridCol w:w="2484"/>
-        <w:gridCol w:w="2484"/>
-        <w:gridCol w:w="2484"/>
-        <w:gridCol w:w="2484"/>
-      </w:tblGrid>
-      <w:tr>
-        <w:tc>
-          <w:tcPr>
-            <w:tcW w:type="dxa" w:w="2304"/>
-            <w:shd w:fill="0F4C3A"/>
-            <w:tcMar>
-              <w:top w:w="100" w:type="dxa"/>
-              <w:bottom w:w="100" w:type="dxa"/>
-              <w:left w:w="120" w:type="dxa"/>
-              <w:right w:w="120" w:type="dxa"/>
-            </w:tcMar>
-          </w:tcPr>
-          <w:p>
-            <w:pPr>
-              <w:jc w:val="center"/>
-            </w:pPr>
-            <w:r>
-              <w:rPr>
-                <w:b/>
-                <w:color w:val="FFFFFF"/>
-                <w:sz w:val="18"/>
-              </w:rPr>
-              <w:t>Componente</w:t>
-            </w:r>
-          </w:p>
-        </w:tc>
-        <w:tc>
-          <w:tcPr>
-            <w:tcW w:type="dxa" w:w="2160"/>
-            <w:shd w:fill="0F4C3A"/>
-            <w:tcMar>
-              <w:top w:w="100" w:type="dxa"/>
-              <w:bottom w:w="100" w:type="dxa"/>
-              <w:left w:w="120" w:type="dxa"/>
-              <w:right w:w="120" w:type="dxa"/>
-            </w:tcMar>
-          </w:tcPr>
-          <w:p>
-            <w:pPr>
-              <w:jc w:val="center"/>
-            </w:pPr>
-            <w:r>
-              <w:rPr>
-                <w:b/>
-                <w:color w:val="FFFFFF"/>
-                <w:sz w:val="18"/>
-              </w:rPr>
-              <w:t>Tecnología</w:t>
-            </w:r>
-          </w:p>
-        </w:tc>
-        <w:tc>
-          <w:tcPr>
-            <w:tcW w:type="dxa" w:w="2592"/>
-            <w:shd w:fill="0F4C3A"/>
-            <w:tcMar>
-              <w:top w:w="100" w:type="dxa"/>
-              <w:bottom w:w="100" w:type="dxa"/>
-              <w:left w:w="120" w:type="dxa"/>
-              <w:right w:w="120" w:type="dxa"/>
-            </w:tcMar>
-          </w:tcPr>
-          <w:p>
-            <w:pPr>
-              <w:jc w:val="center"/>
-            </w:pPr>
-            <w:r>
-              <w:rPr>
-                <w:b/>
-                <w:color w:val="FFFFFF"/>
-                <w:sz w:val="18"/>
-              </w:rPr>
-              <w:t>Ubicación en Código</w:t>
-            </w:r>
-          </w:p>
-        </w:tc>
-        <w:tc>
-          <w:tcPr>
-            <w:tcW w:type="dxa" w:w="2304"/>
-            <w:shd w:fill="0F4C3A"/>
-            <w:tcMar>
-              <w:top w:w="100" w:type="dxa"/>
-              <w:bottom w:w="100" w:type="dxa"/>
-              <w:left w:w="120" w:type="dxa"/>
-              <w:right w:w="120" w:type="dxa"/>
-            </w:tcMar>
-          </w:tcPr>
-          <w:p>
-            <w:pPr>
-              <w:jc w:val="center"/>
-            </w:pPr>
-            <w:r>
-              <w:rPr>
-                <w:b/>
-                <w:color w:val="FFFFFF"/>
-                <w:sz w:val="18"/>
-              </w:rPr>
-              <w:t>Estado</w:t>
-            </w:r>
-          </w:p>
-        </w:tc>
-      </w:tr>
-      <w:tr>
-        <w:tc>
-          <w:tcPr>
-            <w:tcW w:type="dxa" w:w="2304"/>
-            <w:shd w:fill="FFFFFF"/>
-            <w:tcMar>
-              <w:top w:w="90" w:type="dxa"/>
-              <w:bottom w:w="90" w:type="dxa"/>
-              <w:left w:w="120" w:type="dxa"/>
-              <w:right w:w="120" w:type="dxa"/>
-            </w:tcMar>
-          </w:tcPr>
-          <w:p>
-            <w:pPr>
-              <w:jc w:val="left"/>
-            </w:pPr>
-            <w:r>
-              <w:rPr>
-                <w:color w:val="1E293B"/>
-                <w:sz w:val="17"/>
-              </w:rPr>
-              <w:t>Lenguaje &amp; UI</w:t>
-            </w:r>
-          </w:p>
-        </w:tc>
-        <w:tc>
-          <w:tcPr>
-            <w:tcW w:type="dxa" w:w="2160"/>
-            <w:shd w:fill="FFFFFF"/>
-            <w:tcMar>
-              <w:top w:w="90" w:type="dxa"/>
-              <w:bottom w:w="90" w:type="dxa"/>
-              <w:left w:w="120" w:type="dxa"/>
-              <w:right w:w="120" w:type="dxa"/>
-            </w:tcMar>
-          </w:tcPr>
-          <w:p>
-            <w:pPr>
-              <w:jc w:val="center"/>
-            </w:pPr>
-            <w:r>
-              <w:rPr>
-                <w:color w:val="1E293B"/>
-                <w:sz w:val="17"/>
-              </w:rPr>
-              <w:t>Kotlin + Material 3</w:t>
-            </w:r>
-          </w:p>
-        </w:tc>
-        <w:tc>
-          <w:tcPr>
-            <w:tcW w:type="dxa" w:w="2592"/>
-            <w:shd w:fill="FFFFFF"/>
-            <w:tcMar>
-              <w:top w:w="90" w:type="dxa"/>
-              <w:bottom w:w="90" w:type="dxa"/>
-              <w:left w:w="120" w:type="dxa"/>
-              <w:right w:w="120" w:type="dxa"/>
-            </w:tcMar>
-          </w:tcPr>
-          <w:p>
-            <w:pPr>
-              <w:jc w:val="center"/>
-            </w:pPr>
-            <w:r>
-              <w:rPr>
-                <w:color w:val="1E293B"/>
-                <w:sz w:val="17"/>
-              </w:rPr>
-              <w:t>ViaticosAndroidApp/app/src</w:t>
-            </w:r>
-          </w:p>
-        </w:tc>
-        <w:tc>
-          <w:tcPr>
-            <w:tcW w:type="dxa" w:w="2304"/>
-            <w:shd w:fill="FFFFFF"/>
-            <w:tcMar>
-              <w:top w:w="90" w:type="dxa"/>
-              <w:bottom w:w="90" w:type="dxa"/>
-              <w:left w:w="120" w:type="dxa"/>
-              <w:right w:w="120" w:type="dxa"/>
-            </w:tcMar>
-          </w:tcPr>
-          <w:p>
-            <w:pPr>
-              <w:jc w:val="left"/>
-            </w:pPr>
-            <w:r>
-              <w:rPr>
-                <w:color w:val="1E293B"/>
-                <w:sz w:val="17"/>
-              </w:rPr>
-              <w:t>Compilado exitosamente</w:t>
-            </w:r>
-          </w:p>
-        </w:tc>
-      </w:tr>
-      <w:tr>
-        <w:tc>
-          <w:tcPr>
-            <w:tcW w:type="dxa" w:w="2304"/>
-            <w:shd w:fill="F8FAFC"/>
-            <w:tcMar>
-              <w:top w:w="90" w:type="dxa"/>
-              <w:bottom w:w="90" w:type="dxa"/>
-              <w:left w:w="120" w:type="dxa"/>
-              <w:right w:w="120" w:type="dxa"/>
-            </w:tcMar>
-          </w:tcPr>
-          <w:p>
-            <w:pPr>
-              <w:jc w:val="left"/>
-            </w:pPr>
-            <w:r>
-              <w:rPr>
-                <w:color w:val="1E293B"/>
-                <w:sz w:val="17"/>
-              </w:rPr>
-              <w:t>Capa de Red</w:t>
-            </w:r>
-          </w:p>
-        </w:tc>
-        <w:tc>
-          <w:tcPr>
-            <w:tcW w:type="dxa" w:w="2160"/>
-            <w:shd w:fill="F8FAFC"/>
-            <w:tcMar>
-              <w:top w:w="90" w:type="dxa"/>
-              <w:bottom w:w="90" w:type="dxa"/>
-              <w:left w:w="120" w:type="dxa"/>
-              <w:right w:w="120" w:type="dxa"/>
-            </w:tcMar>
-          </w:tcPr>
-          <w:p>
-            <w:pPr>
-              <w:jc w:val="center"/>
-            </w:pPr>
-            <w:r>
-              <w:rPr>
-                <w:color w:val="1E293B"/>
-                <w:sz w:val="17"/>
-              </w:rPr>
-              <w:t>Retrofit 2 + Gson</w:t>
-            </w:r>
-          </w:p>
-        </w:tc>
-        <w:tc>
-          <w:tcPr>
-            <w:tcW w:type="dxa" w:w="2592"/>
-            <w:shd w:fill="F8FAFC"/>
-            <w:tcMar>
-              <w:top w:w="90" w:type="dxa"/>
-              <w:bottom w:w="90" w:type="dxa"/>
-              <w:left w:w="120" w:type="dxa"/>
-              <w:right w:w="120" w:type="dxa"/>
-            </w:tcMar>
-          </w:tcPr>
-          <w:p>
-            <w:pPr>
-              <w:jc w:val="center"/>
-            </w:pPr>
-            <w:r>
-              <w:rPr>
-                <w:color w:val="1E293B"/>
-                <w:sz w:val="17"/>
-              </w:rPr>
-              <w:t>network/RetrofitClient.kt</w:t>
-            </w:r>
-          </w:p>
-        </w:tc>
-        <w:tc>
-          <w:tcPr>
-            <w:tcW w:type="dxa" w:w="2304"/>
-            <w:shd w:fill="F8FAFC"/>
-            <w:tcMar>
-              <w:top w:w="90" w:type="dxa"/>
-              <w:bottom w:w="90" w:type="dxa"/>
-              <w:left w:w="120" w:type="dxa"/>
-              <w:right w:w="120" w:type="dxa"/>
-            </w:tcMar>
-          </w:tcPr>
-          <w:p>
-            <w:pPr>
-              <w:jc w:val="left"/>
-            </w:pPr>
-            <w:r>
-              <w:rPr>
-                <w:color w:val="1E293B"/>
-                <w:sz w:val="17"/>
-              </w:rPr>
-              <w:t>Endpoints sincronizados</w:t>
-            </w:r>
-          </w:p>
-        </w:tc>
-      </w:tr>
-      <w:tr>
-        <w:tc>
-          <w:tcPr>
-            <w:tcW w:type="dxa" w:w="2304"/>
-            <w:shd w:fill="FFFFFF"/>
-            <w:tcMar>
-              <w:top w:w="90" w:type="dxa"/>
-              <w:bottom w:w="90" w:type="dxa"/>
-              <w:left w:w="120" w:type="dxa"/>
-              <w:right w:w="120" w:type="dxa"/>
-            </w:tcMar>
-          </w:tcPr>
-          <w:p>
-            <w:pPr>
-              <w:jc w:val="left"/>
-            </w:pPr>
-            <w:r>
-              <w:rPr>
-                <w:color w:val="1E293B"/>
-                <w:sz w:val="17"/>
-              </w:rPr>
-              <w:t>Instalador APK</w:t>
-            </w:r>
-          </w:p>
-        </w:tc>
-        <w:tc>
-          <w:tcPr>
-            <w:tcW w:type="dxa" w:w="2160"/>
-            <w:shd w:fill="FFFFFF"/>
-            <w:tcMar>
-              <w:top w:w="90" w:type="dxa"/>
-              <w:bottom w:w="90" w:type="dxa"/>
-              <w:left w:w="120" w:type="dxa"/>
-              <w:right w:w="120" w:type="dxa"/>
-            </w:tcMar>
-          </w:tcPr>
-          <w:p>
-            <w:pPr>
-              <w:jc w:val="center"/>
-            </w:pPr>
-            <w:r>
-              <w:rPr>
-                <w:color w:val="1E293B"/>
-                <w:sz w:val="17"/>
-              </w:rPr>
-              <w:t>Android SDK 34 (Android 14)</w:t>
-            </w:r>
-          </w:p>
-        </w:tc>
-        <w:tc>
-          <w:tcPr>
-            <w:tcW w:type="dxa" w:w="2592"/>
-            <w:shd w:fill="FFFFFF"/>
-            <w:tcMar>
-              <w:top w:w="90" w:type="dxa"/>
-              <w:bottom w:w="90" w:type="dxa"/>
-              <w:left w:w="120" w:type="dxa"/>
-              <w:right w:w="120" w:type="dxa"/>
-            </w:tcMar>
-          </w:tcPr>
-          <w:p>
-            <w:pPr>
-              <w:jc w:val="center"/>
-            </w:pPr>
-            <w:r>
-              <w:rPr>
-                <w:color w:val="1E293B"/>
-                <w:sz w:val="17"/>
-              </w:rPr>
-              <w:t>c:/Users/Jorge/Desktop/Damian/JLG_Facturacion.apk</w:t>
-            </w:r>
-          </w:p>
-        </w:tc>
-        <w:tc>
-          <w:tcPr>
-            <w:tcW w:type="dxa" w:w="2304"/>
-            <w:shd w:fill="FFFFFF"/>
-            <w:tcMar>
-              <w:top w:w="90" w:type="dxa"/>
-              <w:bottom w:w="90" w:type="dxa"/>
-              <w:left w:w="120" w:type="dxa"/>
-              <w:right w:w="120" w:type="dxa"/>
-            </w:tcMar>
-          </w:tcPr>
-          <w:p>
-            <w:pPr>
-              <w:jc w:val="left"/>
-            </w:pPr>
-            <w:r>
-              <w:rPr>
-                <w:color w:val="1E293B"/>
-                <w:sz w:val="17"/>
-              </w:rPr>
-              <w:t>Listo para instalar</w:t>
-            </w:r>
-          </w:p>
-        </w:tc>
-      </w:tr>
-      <w:tr>
-        <w:tc>
-          <w:tcPr>
-            <w:tcW w:type="dxa" w:w="2304"/>
-            <w:shd w:fill="F8FAFC"/>
-            <w:tcMar>
-              <w:top w:w="90" w:type="dxa"/>
-              <w:bottom w:w="90" w:type="dxa"/>
-              <w:left w:w="120" w:type="dxa"/>
-              <w:right w:w="120" w:type="dxa"/>
-            </w:tcMar>
-          </w:tcPr>
-          <w:p>
-            <w:pPr>
-              <w:jc w:val="left"/>
-            </w:pPr>
-            <w:r>
-              <w:rPr>
-                <w:color w:val="1E293B"/>
-                <w:sz w:val="17"/>
-              </w:rPr>
-              <w:t>Dispositivos Soportados</w:t>
-            </w:r>
-          </w:p>
-        </w:tc>
-        <w:tc>
-          <w:tcPr>
-            <w:tcW w:type="dxa" w:w="2160"/>
-            <w:shd w:fill="F8FAFC"/>
-            <w:tcMar>
-              <w:top w:w="90" w:type="dxa"/>
-              <w:bottom w:w="90" w:type="dxa"/>
-              <w:left w:w="120" w:type="dxa"/>
-              <w:right w:w="120" w:type="dxa"/>
-            </w:tcMar>
-          </w:tcPr>
-          <w:p>
-            <w:pPr>
-              <w:jc w:val="center"/>
-            </w:pPr>
-            <w:r>
-              <w:rPr>
-                <w:color w:val="1E293B"/>
-                <w:sz w:val="17"/>
-              </w:rPr>
-              <w:t>Android 8.0 a Android 15</w:t>
-            </w:r>
-          </w:p>
-        </w:tc>
-        <w:tc>
-          <w:tcPr>
-            <w:tcW w:type="dxa" w:w="2592"/>
-            <w:shd w:fill="F8FAFC"/>
-            <w:tcMar>
-              <w:top w:w="90" w:type="dxa"/>
-              <w:bottom w:w="90" w:type="dxa"/>
-              <w:left w:w="120" w:type="dxa"/>
-              <w:right w:w="120" w:type="dxa"/>
-            </w:tcMar>
-          </w:tcPr>
-          <w:p>
-            <w:pPr>
-              <w:jc w:val="center"/>
-            </w:pPr>
-            <w:r>
-              <w:rPr>
-                <w:color w:val="1E293B"/>
-                <w:sz w:val="17"/>
-              </w:rPr>
-              <w:t>Samsung Galaxy, Xiaomi, Motorola, etc.</w:t>
-            </w:r>
-          </w:p>
-        </w:tc>
-        <w:tc>
-          <w:tcPr>
-            <w:tcW w:type="dxa" w:w="2304"/>
-            <w:shd w:fill="F8FAFC"/>
-            <w:tcMar>
-              <w:top w:w="90" w:type="dxa"/>
-              <w:bottom w:w="90" w:type="dxa"/>
-              <w:left w:w="120" w:type="dxa"/>
-              <w:right w:w="120" w:type="dxa"/>
-            </w:tcMar>
-          </w:tcPr>
-          <w:p>
-            <w:pPr>
-              <w:jc w:val="left"/>
-            </w:pPr>
-            <w:r>
-              <w:rPr>
-                <w:color w:val="1E293B"/>
-                <w:sz w:val="17"/>
-              </w:rPr>
-              <w:t>100% Compatible</w:t>
-            </w:r>
-          </w:p>
-        </w:tc>
-      </w:tr>
-    </w:tbl>
-    <w:p>
-      <w:pPr>
-        <w:spacing w:after="80"/>
-      </w:pPr>
-    </w:p>
-    <w:p>
-      <w:pPr>
-        <w:pStyle w:val="Heading1"/>
-        <w:keepNext/>
-        <w:spacing w:before="280" w:after="120"/>
-      </w:pPr>
-      <w:r>
-        <w:rPr>
-          <w:b/>
-          <w:color w:val="0F4C3A"/>
-          <w:sz w:val="30"/>
-        </w:rPr>
-        <w:t>5. Reglas Fiscales del SAT y Límites del Art. 28 de la LISR</w:t>
-      </w:r>
-    </w:p>
-    <w:p>
-      <w:pPr>
-        <w:spacing w:before="0" w:after="80" w:line="276" w:lineRule="auto"/>
-      </w:pPr>
-      <w:r>
-        <w:rPr>
-          <w:color w:val="334155"/>
-          <w:sz w:val="20"/>
-        </w:rPr>
-        <w:t>El motor fiscal de Jlg Facturación automatiza el cumplimiento estricto de las leyes fiscales mexicanas aplicables a viáticos y comisiones:</w:t>
-      </w:r>
-    </w:p>
-    <w:tbl>
-      <w:tblPr>
-        <w:tblW w:type="auto" w:w="0"/>
-        <w:jc w:val="center"/>
-        <w:tblLayout w:type="fixed"/>
-        <w:tblLook w:firstColumn="1" w:firstRow="1" w:lastColumn="0" w:lastRow="0" w:noHBand="0" w:noVBand="1" w:val="04A0"/>
-      </w:tblPr>
-      <w:tblGrid>
-        <w:gridCol w:w="9936"/>
-      </w:tblGrid>
-      <w:tr>
-        <w:tc>
-          <w:tcPr>
-            <w:tcW w:type="dxa" w:w="9360"/>
-            <w:shd w:fill="EFF6FF"/>
-            <w:tcMar>
-              <w:top w:w="120" w:type="dxa"/>
-              <w:bottom w:w="120" w:type="dxa"/>
-              <w:left w:w="180" w:type="dxa"/>
-              <w:right w:w="180" w:type="dxa"/>
-            </w:tcMar>
-            <w:tcBorders>
-              <w:left w:val="single" w:sz="24" w:space="0" w:color="3B82F6"/>
-              <w:top w:val="none"/>
-              <w:right w:val="none"/>
-              <w:bottom w:val="none"/>
-            </w:tcBorders>
-          </w:tcPr>
-          <w:p>
-            <w:pPr>
-              <w:spacing w:before="40" w:after="40" w:line="276" w:lineRule="auto"/>
-            </w:pPr>
-            <w:r>
-              <w:rPr>
-                <w:b/>
-                <w:color w:val="0F4C3A"/>
-                <w:sz w:val="20"/>
-              </w:rPr>
-              <w:t>Topes Cuantitativos de Alimentos (Art. 28 Fracc. V LISR)</w:t>
-              <w:br/>
-            </w:r>
-            <w:r>
-              <w:rPr>
-                <w:color w:val="334155"/>
-                <w:sz w:val="19"/>
-              </w:rPr>
-              <w:t>• Comisión Nacional: Tope diario deducible de $750.00 MXN por comisionado.</w:t>
-              <w:br/>
-              <w:t>• Comisión en el Extranjero: Tope diario deducible de $1,500.00 MXN por comisionado.</w:t>
-              <w:br/>
-              <w:t>El sistema agrupa automáticamente por día natural. Si en una misma fecha se suben facturas de alimentos por $1,200.00 MXN, el sistema deduce exactamente $750.00 y los restantes $450.00 los clasifica como Excedente No Deducible.</w:t>
-            </w:r>
-          </w:p>
-        </w:tc>
-      </w:tr>
-    </w:tbl>
-    <w:p>
-      <w:pPr>
-        <w:spacing w:after="80"/>
-      </w:pPr>
-    </w:p>
-    <w:p>
-      <w:pPr>
-        <w:spacing w:before="0" w:after="80" w:line="276" w:lineRule="auto"/>
-      </w:pPr>
-      <w:r>
-        <w:rPr>
-          <w:b/>
-          <w:color w:val="0F172A"/>
-          <w:sz w:val="20"/>
-        </w:rPr>
-        <w:t xml:space="preserve">• Regla de Gasolinas y Combustibles: </w:t>
-      </w:r>
-      <w:r>
-        <w:rPr>
-          <w:color w:val="334155"/>
-          <w:sz w:val="20"/>
-        </w:rPr>
-        <w:t>Conforme al Art. 27 Fracc. III de la LISR, el combustible es 100% no deducible si se pagó en efectivo (Forma de Pago 01). Debe liquidarse invariablemente con tarjeta de crédito, débito o monedero electrónico autorizado.</w:t>
-      </w:r>
-    </w:p>
-    <w:p>
-      <w:pPr>
-        <w:spacing w:before="0" w:after="80" w:line="276" w:lineRule="auto"/>
-      </w:pPr>
-      <w:r>
-        <w:rPr>
-          <w:b/>
-          <w:color w:val="0F172A"/>
-          <w:sz w:val="20"/>
-        </w:rPr>
-        <w:t xml:space="preserve">• RFC Receptor Corporativo: </w:t>
-      </w:r>
-      <w:r>
-        <w:rPr>
-          <w:color w:val="334155"/>
-          <w:sz w:val="20"/>
-        </w:rPr>
-        <w:t>El CFDI debe haberse expedido a nombre de Grupo Mercantil Empresarial S.A. de C.V. (RFC GME980512ABC). Facturas a nombre de 'Público en General' (XAXX010101000) o terceros son rechazadas.</w:t>
-      </w:r>
-    </w:p>
-    <w:p>
-      <w:pPr>
-        <w:spacing w:before="0" w:after="80" w:line="276" w:lineRule="auto"/>
-      </w:pPr>
-      <w:r>
-        <w:rPr>
-          <w:b/>
-          <w:color w:val="0F172A"/>
-          <w:sz w:val="20"/>
-        </w:rPr>
-        <w:t xml:space="preserve">• Temporalidad de la Comisión: </w:t>
-      </w:r>
-      <w:r>
-        <w:rPr>
-          <w:color w:val="334155"/>
-          <w:sz w:val="20"/>
-        </w:rPr>
-        <w:t>La fecha de timbrado del XML debe ubicarse dentro del intervalo de la comisión de trabajo, con una tolerancia de 24 horas para facturas extemporáneas de hoteles o peajes.</w:t>
+        <w:t>Al presionar el botón '✕ Rechazar' sobre una factura, el sistema solicita obligatoriamente el 'Motivo de Rechazo de Auditoría' (ej. 'Concepto no deducible según política interna'). Dicho motivo se guarda permanentemente en la factura y el importe deducible se recalcula a $0.00.</w:t>
       </w:r>
     </w:p>
     <w:p>
@@ -2061,7 +2224,7 @@
           <w:color w:val="0F4C3A"/>
           <w:sz w:val="30"/>
         </w:rPr>
-        <w:t>6. Especificación de Endpoints del Backend Node.js</w:t>
+        <w:t>6. Catálogo Completo de Endpoints API REST</w:t>
       </w:r>
     </w:p>
     <w:p>
@@ -2073,7 +2236,7 @@
           <w:color w:val="334155"/>
           <w:sz w:val="20"/>
         </w:rPr>
-        <w:t>El servidor opera en el puerto 4000 e implementa los siguientes endpoints protegidos y públicos:</w:t>
+        <w:t>El backend expone 12 servicios estructurados bajo arquitectura REST:</w:t>
       </w:r>
     </w:p>
     <w:tbl>
@@ -2117,7 +2280,7 @@
         </w:tc>
         <w:tc>
           <w:tcPr>
-            <w:tcW w:type="dxa" w:w="3312"/>
+            <w:tcW w:type="dxa" w:w="3456"/>
             <w:shd w:fill="0F4C3A"/>
             <w:tcMar>
               <w:top w:w="100" w:type="dxa"/>
@@ -2142,7 +2305,7 @@
         </w:tc>
         <w:tc>
           <w:tcPr>
-            <w:tcW w:type="dxa" w:w="2592"/>
+            <w:tcW w:type="dxa" w:w="2880"/>
             <w:shd w:fill="0F4C3A"/>
             <w:tcMar>
               <w:top w:w="100" w:type="dxa"/>
@@ -2161,13 +2324,13 @@
                 <w:color w:val="FFFFFF"/>
                 <w:sz w:val="18"/>
               </w:rPr>
-              <w:t>Propósito</w:t>
+              <w:t>Propósito Funcional</w:t>
             </w:r>
           </w:p>
         </w:tc>
         <w:tc>
           <w:tcPr>
-            <w:tcW w:type="dxa" w:w="2304"/>
+            <w:tcW w:type="dxa" w:w="1872"/>
             <w:shd w:fill="0F4C3A"/>
             <w:tcMar>
               <w:top w:w="100" w:type="dxa"/>
@@ -2186,7 +2349,7 @@
                 <w:color w:val="FFFFFF"/>
                 <w:sz w:val="18"/>
               </w:rPr>
-              <w:t>Autenticación</w:t>
+              <w:t>Seguridad</w:t>
             </w:r>
           </w:p>
         </w:tc>
@@ -2218,7 +2381,31 @@
         </w:tc>
         <w:tc>
           <w:tcPr>
-            <w:tcW w:type="dxa" w:w="3312"/>
+            <w:tcW w:type="dxa" w:w="3456"/>
+            <w:shd w:fill="FFFFFF"/>
+            <w:tcMar>
+              <w:top w:w="90" w:type="dxa"/>
+              <w:bottom w:w="90" w:type="dxa"/>
+              <w:left w:w="120" w:type="dxa"/>
+              <w:right w:w="120" w:type="dxa"/>
+            </w:tcMar>
+          </w:tcPr>
+          <w:p>
+            <w:pPr>
+              <w:jc w:val="left"/>
+            </w:pPr>
+            <w:r>
+              <w:rPr>
+                <w:color w:val="1E293B"/>
+                <w:sz w:val="17"/>
+              </w:rPr>
+              <w:t>/api/empleados</w:t>
+            </w:r>
+          </w:p>
+        </w:tc>
+        <w:tc>
+          <w:tcPr>
+            <w:tcW w:type="dxa" w:w="2880"/>
             <w:shd w:fill="FFFFFF"/>
             <w:tcMar>
               <w:top w:w="90" w:type="dxa"/>
@@ -2236,13 +2423,13 @@
                 <w:color w:val="1E293B"/>
                 <w:sz w:val="17"/>
               </w:rPr>
-              <w:t>/api/empleados</w:t>
+              <w:t>Catálogo de personal con montos enmascarados.</w:t>
             </w:r>
           </w:p>
         </w:tc>
         <w:tc>
           <w:tcPr>
-            <w:tcW w:type="dxa" w:w="2592"/>
+            <w:tcW w:type="dxa" w:w="1872"/>
             <w:shd w:fill="FFFFFF"/>
             <w:tcMar>
               <w:top w:w="90" w:type="dxa"/>
@@ -2254,30 +2441,6 @@
           <w:p>
             <w:pPr>
               <w:jc w:val="center"/>
-            </w:pPr>
-            <w:r>
-              <w:rPr>
-                <w:color w:val="1E293B"/>
-                <w:sz w:val="17"/>
-              </w:rPr>
-              <w:t>Lista de colaboradores con montos enmascarados</w:t>
-            </w:r>
-          </w:p>
-        </w:tc>
-        <w:tc>
-          <w:tcPr>
-            <w:tcW w:type="dxa" w:w="2304"/>
-            <w:shd w:fill="FFFFFF"/>
-            <w:tcMar>
-              <w:top w:w="90" w:type="dxa"/>
-              <w:bottom w:w="90" w:type="dxa"/>
-              <w:left w:w="120" w:type="dxa"/>
-              <w:right w:w="120" w:type="dxa"/>
-            </w:tcMar>
-          </w:tcPr>
-          <w:p>
-            <w:pPr>
-              <w:jc w:val="left"/>
             </w:pPr>
             <w:r>
               <w:rPr>
@@ -2316,7 +2479,31 @@
         </w:tc>
         <w:tc>
           <w:tcPr>
-            <w:tcW w:type="dxa" w:w="3312"/>
+            <w:tcW w:type="dxa" w:w="3456"/>
+            <w:shd w:fill="F8FAFC"/>
+            <w:tcMar>
+              <w:top w:w="90" w:type="dxa"/>
+              <w:bottom w:w="90" w:type="dxa"/>
+              <w:left w:w="120" w:type="dxa"/>
+              <w:right w:w="120" w:type="dxa"/>
+            </w:tcMar>
+          </w:tcPr>
+          <w:p>
+            <w:pPr>
+              <w:jc w:val="left"/>
+            </w:pPr>
+            <w:r>
+              <w:rPr>
+                <w:color w:val="1E293B"/>
+                <w:sz w:val="17"/>
+              </w:rPr>
+              <w:t>/api/empleados/:id/verificar-clave</w:t>
+            </w:r>
+          </w:p>
+        </w:tc>
+        <w:tc>
+          <w:tcPr>
+            <w:tcW w:type="dxa" w:w="2880"/>
             <w:shd w:fill="F8FAFC"/>
             <w:tcMar>
               <w:top w:w="90" w:type="dxa"/>
@@ -2334,13 +2521,13 @@
                 <w:color w:val="1E293B"/>
                 <w:sz w:val="17"/>
               </w:rPr>
-              <w:t>/api/empleados/:id/verificar-clave</w:t>
+              <w:t>Valida la clave única alfanumérica del colaborador.</w:t>
             </w:r>
           </w:p>
         </w:tc>
         <w:tc>
           <w:tcPr>
-            <w:tcW w:type="dxa" w:w="2592"/>
+            <w:tcW w:type="dxa" w:w="1872"/>
             <w:shd w:fill="F8FAFC"/>
             <w:tcMar>
               <w:top w:w="90" w:type="dxa"/>
@@ -2352,30 +2539,6 @@
           <w:p>
             <w:pPr>
               <w:jc w:val="center"/>
-            </w:pPr>
-            <w:r>
-              <w:rPr>
-                <w:color w:val="1E293B"/>
-                <w:sz w:val="17"/>
-              </w:rPr>
-              <w:t>Valida clave única alfanumérica y desbloquea sesión</w:t>
-            </w:r>
-          </w:p>
-        </w:tc>
-        <w:tc>
-          <w:tcPr>
-            <w:tcW w:type="dxa" w:w="2304"/>
-            <w:shd w:fill="F8FAFC"/>
-            <w:tcMar>
-              <w:top w:w="90" w:type="dxa"/>
-              <w:bottom w:w="90" w:type="dxa"/>
-              <w:left w:w="120" w:type="dxa"/>
-              <w:right w:w="120" w:type="dxa"/>
-            </w:tcMar>
-          </w:tcPr>
-          <w:p>
-            <w:pPr>
-              <w:jc w:val="left"/>
             </w:pPr>
             <w:r>
               <w:rPr>
@@ -2414,7 +2577,31 @@
         </w:tc>
         <w:tc>
           <w:tcPr>
-            <w:tcW w:type="dxa" w:w="3312"/>
+            <w:tcW w:type="dxa" w:w="3456"/>
+            <w:shd w:fill="FFFFFF"/>
+            <w:tcMar>
+              <w:top w:w="90" w:type="dxa"/>
+              <w:bottom w:w="90" w:type="dxa"/>
+              <w:left w:w="120" w:type="dxa"/>
+              <w:right w:w="120" w:type="dxa"/>
+            </w:tcMar>
+          </w:tcPr>
+          <w:p>
+            <w:pPr>
+              <w:jc w:val="left"/>
+            </w:pPr>
+            <w:r>
+              <w:rPr>
+                <w:color w:val="1E293B"/>
+                <w:sz w:val="17"/>
+              </w:rPr>
+              <w:t>/api/empleados/:id/viaje</w:t>
+            </w:r>
+          </w:p>
+        </w:tc>
+        <w:tc>
+          <w:tcPr>
+            <w:tcW w:type="dxa" w:w="2880"/>
             <w:shd w:fill="FFFFFF"/>
             <w:tcMar>
               <w:top w:w="90" w:type="dxa"/>
@@ -2432,13 +2619,13 @@
                 <w:color w:val="1E293B"/>
                 <w:sz w:val="17"/>
               </w:rPr>
-              <w:t>/api/empleados/:id/viaje</w:t>
+              <w:t>Liquidación actual, saldos y comprobantes registrados.</w:t>
             </w:r>
           </w:p>
         </w:tc>
         <w:tc>
           <w:tcPr>
-            <w:tcW w:type="dxa" w:w="2592"/>
+            <w:tcW w:type="dxa" w:w="1872"/>
             <w:shd w:fill="FFFFFF"/>
             <w:tcMar>
               <w:top w:w="90" w:type="dxa"/>
@@ -2450,30 +2637,6 @@
           <w:p>
             <w:pPr>
               <w:jc w:val="center"/>
-            </w:pPr>
-            <w:r>
-              <w:rPr>
-                <w:color w:val="1E293B"/>
-                <w:sz w:val="17"/>
-              </w:rPr>
-              <w:t>Obtiene liquidación, saldos y comprobantes</w:t>
-            </w:r>
-          </w:p>
-        </w:tc>
-        <w:tc>
-          <w:tcPr>
-            <w:tcW w:type="dxa" w:w="2304"/>
-            <w:shd w:fill="FFFFFF"/>
-            <w:tcMar>
-              <w:top w:w="90" w:type="dxa"/>
-              <w:bottom w:w="90" w:type="dxa"/>
-              <w:left w:w="120" w:type="dxa"/>
-              <w:right w:w="120" w:type="dxa"/>
-            </w:tcMar>
-          </w:tcPr>
-          <w:p>
-            <w:pPr>
-              <w:jc w:val="left"/>
             </w:pPr>
             <w:r>
               <w:rPr>
@@ -2512,7 +2675,31 @@
         </w:tc>
         <w:tc>
           <w:tcPr>
-            <w:tcW w:type="dxa" w:w="3312"/>
+            <w:tcW w:type="dxa" w:w="3456"/>
+            <w:shd w:fill="F8FAFC"/>
+            <w:tcMar>
+              <w:top w:w="90" w:type="dxa"/>
+              <w:bottom w:w="90" w:type="dxa"/>
+              <w:left w:w="120" w:type="dxa"/>
+              <w:right w:w="120" w:type="dxa"/>
+            </w:tcMar>
+          </w:tcPr>
+          <w:p>
+            <w:pPr>
+              <w:jc w:val="left"/>
+            </w:pPr>
+            <w:r>
+              <w:rPr>
+                <w:color w:val="1E293B"/>
+                <w:sz w:val="17"/>
+              </w:rPr>
+              <w:t>/api/empleados/:id/validar-comprobante</w:t>
+            </w:r>
+          </w:p>
+        </w:tc>
+        <w:tc>
+          <w:tcPr>
+            <w:tcW w:type="dxa" w:w="2880"/>
             <w:shd w:fill="F8FAFC"/>
             <w:tcMar>
               <w:top w:w="90" w:type="dxa"/>
@@ -2530,13 +2717,13 @@
                 <w:color w:val="1E293B"/>
                 <w:sz w:val="17"/>
               </w:rPr>
-              <w:t>/api/empleados/:id/validar-comprobante</w:t>
+              <w:t>Valida XML CFDI 4.0 contra SAT y reglas del Art. 28 LISR.</w:t>
             </w:r>
           </w:p>
         </w:tc>
         <w:tc>
           <w:tcPr>
-            <w:tcW w:type="dxa" w:w="2592"/>
+            <w:tcW w:type="dxa" w:w="1872"/>
             <w:shd w:fill="F8FAFC"/>
             <w:tcMar>
               <w:top w:w="90" w:type="dxa"/>
@@ -2548,30 +2735,6 @@
           <w:p>
             <w:pPr>
               <w:jc w:val="center"/>
-            </w:pPr>
-            <w:r>
-              <w:rPr>
-                <w:color w:val="1E293B"/>
-                <w:sz w:val="17"/>
-              </w:rPr>
-              <w:t>Parsea y valida XML CFDI 4.0 contra reglas SAT</w:t>
-            </w:r>
-          </w:p>
-        </w:tc>
-        <w:tc>
-          <w:tcPr>
-            <w:tcW w:type="dxa" w:w="2304"/>
-            <w:shd w:fill="F8FAFC"/>
-            <w:tcMar>
-              <w:top w:w="90" w:type="dxa"/>
-              <w:bottom w:w="90" w:type="dxa"/>
-              <w:left w:w="120" w:type="dxa"/>
-              <w:right w:w="120" w:type="dxa"/>
-            </w:tcMar>
-          </w:tcPr>
-          <w:p>
-            <w:pPr>
-              <w:jc w:val="left"/>
             </w:pPr>
             <w:r>
               <w:rPr>
@@ -2610,7 +2773,31 @@
         </w:tc>
         <w:tc>
           <w:tcPr>
-            <w:tcW w:type="dxa" w:w="3312"/>
+            <w:tcW w:type="dxa" w:w="3456"/>
+            <w:shd w:fill="FFFFFF"/>
+            <w:tcMar>
+              <w:top w:w="90" w:type="dxa"/>
+              <w:bottom w:w="90" w:type="dxa"/>
+              <w:left w:w="120" w:type="dxa"/>
+              <w:right w:w="120" w:type="dxa"/>
+            </w:tcMar>
+          </w:tcPr>
+          <w:p>
+            <w:pPr>
+              <w:jc w:val="left"/>
+            </w:pPr>
+            <w:r>
+              <w:rPr>
+                <w:color w:val="1E293B"/>
+                <w:sz w:val="17"/>
+              </w:rPr>
+              <w:t>/api/admin/login</w:t>
+            </w:r>
+          </w:p>
+        </w:tc>
+        <w:tc>
+          <w:tcPr>
+            <w:tcW w:type="dxa" w:w="2880"/>
             <w:shd w:fill="FFFFFF"/>
             <w:tcMar>
               <w:top w:w="90" w:type="dxa"/>
@@ -2628,13 +2815,13 @@
                 <w:color w:val="1E293B"/>
                 <w:sz w:val="17"/>
               </w:rPr>
-              <w:t>/api/admin/login</w:t>
+              <w:t>Autenticación maestra con Bcrypt y generación de token.</w:t>
             </w:r>
           </w:p>
         </w:tc>
         <w:tc>
           <w:tcPr>
-            <w:tcW w:type="dxa" w:w="2592"/>
+            <w:tcW w:type="dxa" w:w="1872"/>
             <w:shd w:fill="FFFFFF"/>
             <w:tcMar>
               <w:top w:w="90" w:type="dxa"/>
@@ -2652,31 +2839,7 @@
                 <w:color w:val="1E293B"/>
                 <w:sz w:val="17"/>
               </w:rPr>
-              <w:t>Autenticación maestra con Bcrypt (token Bearer)</w:t>
-            </w:r>
-          </w:p>
-        </w:tc>
-        <w:tc>
-          <w:tcPr>
-            <w:tcW w:type="dxa" w:w="2304"/>
-            <w:shd w:fill="FFFFFF"/>
-            <w:tcMar>
-              <w:top w:w="90" w:type="dxa"/>
-              <w:bottom w:w="90" w:type="dxa"/>
-              <w:left w:w="120" w:type="dxa"/>
-              <w:right w:w="120" w:type="dxa"/>
-            </w:tcMar>
-          </w:tcPr>
-          <w:p>
-            <w:pPr>
-              <w:jc w:val="left"/>
-            </w:pPr>
-            <w:r>
-              <w:rPr>
-                <w:color w:val="1E293B"/>
-                <w:sz w:val="17"/>
-              </w:rPr>
-              <w:t>Público</w:t>
+              <w:t>Rate Limited</w:t>
             </w:r>
           </w:p>
         </w:tc>
@@ -2708,7 +2871,31 @@
         </w:tc>
         <w:tc>
           <w:tcPr>
-            <w:tcW w:type="dxa" w:w="3312"/>
+            <w:tcW w:type="dxa" w:w="3456"/>
+            <w:shd w:fill="F8FAFC"/>
+            <w:tcMar>
+              <w:top w:w="90" w:type="dxa"/>
+              <w:bottom w:w="90" w:type="dxa"/>
+              <w:left w:w="120" w:type="dxa"/>
+              <w:right w:w="120" w:type="dxa"/>
+            </w:tcMar>
+          </w:tcPr>
+          <w:p>
+            <w:pPr>
+              <w:jc w:val="left"/>
+            </w:pPr>
+            <w:r>
+              <w:rPr>
+                <w:color w:val="1E293B"/>
+                <w:sz w:val="17"/>
+              </w:rPr>
+              <w:t>/api/admin/verificar-sesion</w:t>
+            </w:r>
+          </w:p>
+        </w:tc>
+        <w:tc>
+          <w:tcPr>
+            <w:tcW w:type="dxa" w:w="2880"/>
             <w:shd w:fill="F8FAFC"/>
             <w:tcMar>
               <w:top w:w="90" w:type="dxa"/>
@@ -2726,13 +2913,13 @@
                 <w:color w:val="1E293B"/>
                 <w:sz w:val="17"/>
               </w:rPr>
-              <w:t>/api/admin/usuarios</w:t>
+              <w:t>Verifica la validez del token de sesión administrativa.</w:t>
             </w:r>
           </w:p>
         </w:tc>
         <w:tc>
           <w:tcPr>
-            <w:tcW w:type="dxa" w:w="2592"/>
+            <w:tcW w:type="dxa" w:w="1872"/>
             <w:shd w:fill="F8FAFC"/>
             <w:tcMar>
               <w:top w:w="90" w:type="dxa"/>
@@ -2750,13 +2937,113 @@
                 <w:color w:val="1E293B"/>
                 <w:sz w:val="17"/>
               </w:rPr>
-              <w:t>Lista completa de usuarios con claves visibles</w:t>
+              <w:t>Bearer Token</w:t>
+            </w:r>
+          </w:p>
+        </w:tc>
+      </w:tr>
+      <w:tr>
+        <w:tc>
+          <w:tcPr>
+            <w:tcW w:type="dxa" w:w="1152"/>
+            <w:shd w:fill="FFFFFF"/>
+            <w:tcMar>
+              <w:top w:w="90" w:type="dxa"/>
+              <w:bottom w:w="90" w:type="dxa"/>
+              <w:left w:w="120" w:type="dxa"/>
+              <w:right w:w="120" w:type="dxa"/>
+            </w:tcMar>
+          </w:tcPr>
+          <w:p>
+            <w:pPr>
+              <w:jc w:val="left"/>
+            </w:pPr>
+            <w:r>
+              <w:rPr>
+                <w:color w:val="1E293B"/>
+                <w:sz w:val="17"/>
+              </w:rPr>
+              <w:t>POST</w:t>
             </w:r>
           </w:p>
         </w:tc>
         <w:tc>
           <w:tcPr>
-            <w:tcW w:type="dxa" w:w="2304"/>
+            <w:tcW w:type="dxa" w:w="3456"/>
+            <w:shd w:fill="FFFFFF"/>
+            <w:tcMar>
+              <w:top w:w="90" w:type="dxa"/>
+              <w:bottom w:w="90" w:type="dxa"/>
+              <w:left w:w="120" w:type="dxa"/>
+              <w:right w:w="120" w:type="dxa"/>
+            </w:tcMar>
+          </w:tcPr>
+          <w:p>
+            <w:pPr>
+              <w:jc w:val="left"/>
+            </w:pPr>
+            <w:r>
+              <w:rPr>
+                <w:color w:val="1E293B"/>
+                <w:sz w:val="17"/>
+              </w:rPr>
+              <w:t>/api/admin/logout</w:t>
+            </w:r>
+          </w:p>
+        </w:tc>
+        <w:tc>
+          <w:tcPr>
+            <w:tcW w:type="dxa" w:w="2880"/>
+            <w:shd w:fill="FFFFFF"/>
+            <w:tcMar>
+              <w:top w:w="90" w:type="dxa"/>
+              <w:bottom w:w="90" w:type="dxa"/>
+              <w:left w:w="120" w:type="dxa"/>
+              <w:right w:w="120" w:type="dxa"/>
+            </w:tcMar>
+          </w:tcPr>
+          <w:p>
+            <w:pPr>
+              <w:jc w:val="center"/>
+            </w:pPr>
+            <w:r>
+              <w:rPr>
+                <w:color w:val="1E293B"/>
+                <w:sz w:val="17"/>
+              </w:rPr>
+              <w:t>Revoca la sesión activa del administrador.</w:t>
+            </w:r>
+          </w:p>
+        </w:tc>
+        <w:tc>
+          <w:tcPr>
+            <w:tcW w:type="dxa" w:w="1872"/>
+            <w:shd w:fill="FFFFFF"/>
+            <w:tcMar>
+              <w:top w:w="90" w:type="dxa"/>
+              <w:bottom w:w="90" w:type="dxa"/>
+              <w:left w:w="120" w:type="dxa"/>
+              <w:right w:w="120" w:type="dxa"/>
+            </w:tcMar>
+          </w:tcPr>
+          <w:p>
+            <w:pPr>
+              <w:jc w:val="center"/>
+            </w:pPr>
+            <w:r>
+              <w:rPr>
+                <w:color w:val="1E293B"/>
+                <w:sz w:val="17"/>
+              </w:rPr>
+              <w:t>Bearer Token</w:t>
+            </w:r>
+          </w:p>
+        </w:tc>
+      </w:tr>
+      <w:tr>
+        <w:tc>
+          <w:tcPr>
+            <w:tcW w:type="dxa" w:w="1152"/>
             <w:shd w:fill="F8FAFC"/>
             <w:tcMar>
               <w:top w:w="90" w:type="dxa"/>
@@ -2774,7 +3061,275 @@
                 <w:color w:val="1E293B"/>
                 <w:sz w:val="17"/>
               </w:rPr>
-              <w:t>Bearer Admin Token</w:t>
+              <w:t>GET</w:t>
+            </w:r>
+          </w:p>
+        </w:tc>
+        <w:tc>
+          <w:tcPr>
+            <w:tcW w:type="dxa" w:w="3456"/>
+            <w:shd w:fill="F8FAFC"/>
+            <w:tcMar>
+              <w:top w:w="90" w:type="dxa"/>
+              <w:bottom w:w="90" w:type="dxa"/>
+              <w:left w:w="120" w:type="dxa"/>
+              <w:right w:w="120" w:type="dxa"/>
+            </w:tcMar>
+          </w:tcPr>
+          <w:p>
+            <w:pPr>
+              <w:jc w:val="left"/>
+            </w:pPr>
+            <w:r>
+              <w:rPr>
+                <w:color w:val="1E293B"/>
+                <w:sz w:val="17"/>
+              </w:rPr>
+              <w:t>/api/admin/usuarios</w:t>
+            </w:r>
+          </w:p>
+        </w:tc>
+        <w:tc>
+          <w:tcPr>
+            <w:tcW w:type="dxa" w:w="2880"/>
+            <w:shd w:fill="F8FAFC"/>
+            <w:tcMar>
+              <w:top w:w="90" w:type="dxa"/>
+              <w:bottom w:w="90" w:type="dxa"/>
+              <w:left w:w="120" w:type="dxa"/>
+              <w:right w:w="120" w:type="dxa"/>
+            </w:tcMar>
+          </w:tcPr>
+          <w:p>
+            <w:pPr>
+              <w:jc w:val="center"/>
+            </w:pPr>
+            <w:r>
+              <w:rPr>
+                <w:color w:val="1E293B"/>
+                <w:sz w:val="17"/>
+              </w:rPr>
+              <w:t>Listado maestro de usuarios con claves y viajes visibles.</w:t>
+            </w:r>
+          </w:p>
+        </w:tc>
+        <w:tc>
+          <w:tcPr>
+            <w:tcW w:type="dxa" w:w="1872"/>
+            <w:shd w:fill="F8FAFC"/>
+            <w:tcMar>
+              <w:top w:w="90" w:type="dxa"/>
+              <w:bottom w:w="90" w:type="dxa"/>
+              <w:left w:w="120" w:type="dxa"/>
+              <w:right w:w="120" w:type="dxa"/>
+            </w:tcMar>
+          </w:tcPr>
+          <w:p>
+            <w:pPr>
+              <w:jc w:val="center"/>
+            </w:pPr>
+            <w:r>
+              <w:rPr>
+                <w:color w:val="1E293B"/>
+                <w:sz w:val="17"/>
+              </w:rPr>
+              <w:t>Bearer Token</w:t>
+            </w:r>
+          </w:p>
+        </w:tc>
+      </w:tr>
+      <w:tr>
+        <w:tc>
+          <w:tcPr>
+            <w:tcW w:type="dxa" w:w="1152"/>
+            <w:shd w:fill="FFFFFF"/>
+            <w:tcMar>
+              <w:top w:w="90" w:type="dxa"/>
+              <w:bottom w:w="90" w:type="dxa"/>
+              <w:left w:w="120" w:type="dxa"/>
+              <w:right w:w="120" w:type="dxa"/>
+            </w:tcMar>
+          </w:tcPr>
+          <w:p>
+            <w:pPr>
+              <w:jc w:val="left"/>
+            </w:pPr>
+            <w:r>
+              <w:rPr>
+                <w:color w:val="1E293B"/>
+                <w:sz w:val="17"/>
+              </w:rPr>
+              <w:t>POST</w:t>
+            </w:r>
+          </w:p>
+        </w:tc>
+        <w:tc>
+          <w:tcPr>
+            <w:tcW w:type="dxa" w:w="3456"/>
+            <w:shd w:fill="FFFFFF"/>
+            <w:tcMar>
+              <w:top w:w="90" w:type="dxa"/>
+              <w:bottom w:w="90" w:type="dxa"/>
+              <w:left w:w="120" w:type="dxa"/>
+              <w:right w:w="120" w:type="dxa"/>
+            </w:tcMar>
+          </w:tcPr>
+          <w:p>
+            <w:pPr>
+              <w:jc w:val="left"/>
+            </w:pPr>
+            <w:r>
+              <w:rPr>
+                <w:color w:val="1E293B"/>
+                <w:sz w:val="17"/>
+              </w:rPr>
+              <w:t>/api/admin/usuarios</w:t>
+            </w:r>
+          </w:p>
+        </w:tc>
+        <w:tc>
+          <w:tcPr>
+            <w:tcW w:type="dxa" w:w="2880"/>
+            <w:shd w:fill="FFFFFF"/>
+            <w:tcMar>
+              <w:top w:w="90" w:type="dxa"/>
+              <w:bottom w:w="90" w:type="dxa"/>
+              <w:left w:w="120" w:type="dxa"/>
+              <w:right w:w="120" w:type="dxa"/>
+            </w:tcMar>
+          </w:tcPr>
+          <w:p>
+            <w:pPr>
+              <w:jc w:val="center"/>
+            </w:pPr>
+            <w:r>
+              <w:rPr>
+                <w:color w:val="1E293B"/>
+                <w:sz w:val="17"/>
+              </w:rPr>
+              <w:t>Alta de nuevo colaborador con 12 campos completos.</w:t>
+            </w:r>
+          </w:p>
+        </w:tc>
+        <w:tc>
+          <w:tcPr>
+            <w:tcW w:type="dxa" w:w="1872"/>
+            <w:shd w:fill="FFFFFF"/>
+            <w:tcMar>
+              <w:top w:w="90" w:type="dxa"/>
+              <w:bottom w:w="90" w:type="dxa"/>
+              <w:left w:w="120" w:type="dxa"/>
+              <w:right w:w="120" w:type="dxa"/>
+            </w:tcMar>
+          </w:tcPr>
+          <w:p>
+            <w:pPr>
+              <w:jc w:val="center"/>
+            </w:pPr>
+            <w:r>
+              <w:rPr>
+                <w:color w:val="1E293B"/>
+                <w:sz w:val="17"/>
+              </w:rPr>
+              <w:t>Bearer Token</w:t>
+            </w:r>
+          </w:p>
+        </w:tc>
+      </w:tr>
+      <w:tr>
+        <w:tc>
+          <w:tcPr>
+            <w:tcW w:type="dxa" w:w="1152"/>
+            <w:shd w:fill="F8FAFC"/>
+            <w:tcMar>
+              <w:top w:w="90" w:type="dxa"/>
+              <w:bottom w:w="90" w:type="dxa"/>
+              <w:left w:w="120" w:type="dxa"/>
+              <w:right w:w="120" w:type="dxa"/>
+            </w:tcMar>
+          </w:tcPr>
+          <w:p>
+            <w:pPr>
+              <w:jc w:val="left"/>
+            </w:pPr>
+            <w:r>
+              <w:rPr>
+                <w:color w:val="1E293B"/>
+                <w:sz w:val="17"/>
+              </w:rPr>
+              <w:t>PUT</w:t>
+            </w:r>
+          </w:p>
+        </w:tc>
+        <w:tc>
+          <w:tcPr>
+            <w:tcW w:type="dxa" w:w="3456"/>
+            <w:shd w:fill="F8FAFC"/>
+            <w:tcMar>
+              <w:top w:w="90" w:type="dxa"/>
+              <w:bottom w:w="90" w:type="dxa"/>
+              <w:left w:w="120" w:type="dxa"/>
+              <w:right w:w="120" w:type="dxa"/>
+            </w:tcMar>
+          </w:tcPr>
+          <w:p>
+            <w:pPr>
+              <w:jc w:val="left"/>
+            </w:pPr>
+            <w:r>
+              <w:rPr>
+                <w:color w:val="1E293B"/>
+                <w:sz w:val="17"/>
+              </w:rPr>
+              <w:t>/api/admin/usuarios/:id</w:t>
+            </w:r>
+          </w:p>
+        </w:tc>
+        <w:tc>
+          <w:tcPr>
+            <w:tcW w:type="dxa" w:w="2880"/>
+            <w:shd w:fill="F8FAFC"/>
+            <w:tcMar>
+              <w:top w:w="90" w:type="dxa"/>
+              <w:bottom w:w="90" w:type="dxa"/>
+              <w:left w:w="120" w:type="dxa"/>
+              <w:right w:w="120" w:type="dxa"/>
+            </w:tcMar>
+          </w:tcPr>
+          <w:p>
+            <w:pPr>
+              <w:jc w:val="center"/>
+            </w:pPr>
+            <w:r>
+              <w:rPr>
+                <w:color w:val="1E293B"/>
+                <w:sz w:val="17"/>
+              </w:rPr>
+              <w:t>Actualización integral de datos y comisión del usuario.</w:t>
+            </w:r>
+          </w:p>
+        </w:tc>
+        <w:tc>
+          <w:tcPr>
+            <w:tcW w:type="dxa" w:w="1872"/>
+            <w:shd w:fill="F8FAFC"/>
+            <w:tcMar>
+              <w:top w:w="90" w:type="dxa"/>
+              <w:bottom w:w="90" w:type="dxa"/>
+              <w:left w:w="120" w:type="dxa"/>
+              <w:right w:w="120" w:type="dxa"/>
+            </w:tcMar>
+          </w:tcPr>
+          <w:p>
+            <w:pPr>
+              <w:jc w:val="center"/>
+            </w:pPr>
+            <w:r>
+              <w:rPr>
+                <w:color w:val="1E293B"/>
+                <w:sz w:val="17"/>
+              </w:rPr>
+              <w:t>Bearer Token</w:t>
             </w:r>
           </w:p>
         </w:tc>
@@ -2806,7 +3361,31 @@
         </w:tc>
         <w:tc>
           <w:tcPr>
-            <w:tcW w:type="dxa" w:w="3312"/>
+            <w:tcW w:type="dxa" w:w="3456"/>
+            <w:shd w:fill="FFFFFF"/>
+            <w:tcMar>
+              <w:top w:w="90" w:type="dxa"/>
+              <w:bottom w:w="90" w:type="dxa"/>
+              <w:left w:w="120" w:type="dxa"/>
+              <w:right w:w="120" w:type="dxa"/>
+            </w:tcMar>
+          </w:tcPr>
+          <w:p>
+            <w:pPr>
+              <w:jc w:val="left"/>
+            </w:pPr>
+            <w:r>
+              <w:rPr>
+                <w:color w:val="1E293B"/>
+                <w:sz w:val="17"/>
+              </w:rPr>
+              <w:t>/api/admin/empleados/:id/comprobantes/:uuid/estatus</w:t>
+            </w:r>
+          </w:p>
+        </w:tc>
+        <w:tc>
+          <w:tcPr>
+            <w:tcW w:type="dxa" w:w="2880"/>
             <w:shd w:fill="FFFFFF"/>
             <w:tcMar>
               <w:top w:w="90" w:type="dxa"/>
@@ -2824,13 +3403,13 @@
                 <w:color w:val="1E293B"/>
                 <w:sz w:val="17"/>
               </w:rPr>
-              <w:t>/api/admin/empleados/:id/comprobantes/:uuid/estatus</w:t>
+              <w:t>Aprobación o Rechazo de factura con motivo de auditoría.</w:t>
             </w:r>
           </w:p>
         </w:tc>
         <w:tc>
           <w:tcPr>
-            <w:tcW w:type="dxa" w:w="2592"/>
+            <w:tcW w:type="dxa" w:w="1872"/>
             <w:shd w:fill="FFFFFF"/>
             <w:tcMar>
               <w:top w:w="90" w:type="dxa"/>
@@ -2848,14 +3427,16 @@
                 <w:color w:val="1E293B"/>
                 <w:sz w:val="17"/>
               </w:rPr>
-              <w:t>Acepta o Rechaza una factura y recalcula saldos</w:t>
+              <w:t>Bearer Token</w:t>
             </w:r>
           </w:p>
         </w:tc>
+      </w:tr>
+      <w:tr>
         <w:tc>
           <w:tcPr>
-            <w:tcW w:type="dxa" w:w="2304"/>
-            <w:shd w:fill="FFFFFF"/>
+            <w:tcW w:type="dxa" w:w="1152"/>
+            <w:shd w:fill="F8FAFC"/>
             <w:tcMar>
               <w:top w:w="90" w:type="dxa"/>
               <w:bottom w:w="90" w:type="dxa"/>
@@ -2872,7 +3453,79 @@
                 <w:color w:val="1E293B"/>
                 <w:sz w:val="17"/>
               </w:rPr>
-              <w:t>Bearer Admin Token</w:t>
+              <w:t>GET</w:t>
+            </w:r>
+          </w:p>
+        </w:tc>
+        <w:tc>
+          <w:tcPr>
+            <w:tcW w:type="dxa" w:w="3456"/>
+            <w:shd w:fill="F8FAFC"/>
+            <w:tcMar>
+              <w:top w:w="90" w:type="dxa"/>
+              <w:bottom w:w="90" w:type="dxa"/>
+              <w:left w:w="120" w:type="dxa"/>
+              <w:right w:w="120" w:type="dxa"/>
+            </w:tcMar>
+          </w:tcPr>
+          <w:p>
+            <w:pPr>
+              <w:jc w:val="left"/>
+            </w:pPr>
+            <w:r>
+              <w:rPr>
+                <w:color w:val="1E293B"/>
+                <w:sz w:val="17"/>
+              </w:rPr>
+              <w:t>/ViaticosApp.apk</w:t>
+            </w:r>
+          </w:p>
+        </w:tc>
+        <w:tc>
+          <w:tcPr>
+            <w:tcW w:type="dxa" w:w="2880"/>
+            <w:shd w:fill="F8FAFC"/>
+            <w:tcMar>
+              <w:top w:w="90" w:type="dxa"/>
+              <w:bottom w:w="90" w:type="dxa"/>
+              <w:left w:w="120" w:type="dxa"/>
+              <w:right w:w="120" w:type="dxa"/>
+            </w:tcMar>
+          </w:tcPr>
+          <w:p>
+            <w:pPr>
+              <w:jc w:val="center"/>
+            </w:pPr>
+            <w:r>
+              <w:rPr>
+                <w:color w:val="1E293B"/>
+                <w:sz w:val="17"/>
+              </w:rPr>
+              <w:t>Descarga directa del instalador de la app móvil Android.</w:t>
+            </w:r>
+          </w:p>
+        </w:tc>
+        <w:tc>
+          <w:tcPr>
+            <w:tcW w:type="dxa" w:w="1872"/>
+            <w:shd w:fill="F8FAFC"/>
+            <w:tcMar>
+              <w:top w:w="90" w:type="dxa"/>
+              <w:bottom w:w="90" w:type="dxa"/>
+              <w:left w:w="120" w:type="dxa"/>
+              <w:right w:w="120" w:type="dxa"/>
+            </w:tcMar>
+          </w:tcPr>
+          <w:p>
+            <w:pPr>
+              <w:jc w:val="center"/>
+            </w:pPr>
+            <w:r>
+              <w:rPr>
+                <w:color w:val="1E293B"/>
+                <w:sz w:val="17"/>
+              </w:rPr>
+              <w:t>Público</w:t>
             </w:r>
           </w:p>
         </w:tc>
@@ -2895,7 +3548,7 @@
           <w:color w:val="0F4C3A"/>
           <w:sz w:val="30"/>
         </w:rPr>
-        <w:t>7. Guía Rápida para Abrir el Portal y Conectar la App</w:t>
+        <w:t>7. Guía de Conexión Cloud 24/7 y Descarga del APK</w:t>
       </w:r>
     </w:p>
     <w:tbl>
@@ -2912,7 +3565,7 @@
         <w:tc>
           <w:tcPr>
             <w:tcW w:type="dxa" w:w="9360"/>
-            <w:shd w:fill="F0FDF4"/>
+            <w:shd w:fill="EFF6FF"/>
             <w:tcMar>
               <w:top w:w="120" w:type="dxa"/>
               <w:bottom w:w="120" w:type="dxa"/>
@@ -2920,7 +3573,7 @@
               <w:right w:w="180" w:type="dxa"/>
             </w:tcMar>
             <w:tcBorders>
-              <w:left w:val="single" w:sz="24" w:space="0" w:color="10B981"/>
+              <w:left w:val="single" w:sz="24" w:space="0" w:color="3B82F6"/>
               <w:top w:val="none"/>
               <w:right w:val="none"/>
               <w:bottom w:val="none"/>
@@ -2936,7 +3589,7 @@
                 <w:color w:val="0F4C3A"/>
                 <w:sz w:val="20"/>
               </w:rPr>
-              <w:t>Despliegue Cloud en Vivo 24/7 (100% Gratuito)</w:t>
+              <w:t>🌐 Infraestructura en Producción Cloud (Render 24/7)</w:t>
               <w:br/>
             </w:r>
             <w:r>
@@ -2944,13 +3597,13 @@
                 <w:color w:val="334155"/>
                 <w:sz w:val="19"/>
               </w:rPr>
-              <w:t>• URL Oficial en la Nube: https://jlg-facturacion.onrender.com/</w:t>
+              <w:t>• URL Oficial en Vivo: https://jlg-facturacion.onrender.com/</w:t>
               <w:br/>
-              <w:t>• Estado: Producción Activa (Live)</w:t>
+              <w:t>• Repositorio Oficial en GitHub: https://github.com/jorgecesba/jlg-facturacion.git</w:t>
               <w:br/>
-              <w:t>• Disponibilidad: 24 horas del día, los 365 días del año sin necesidad de encender la computadora del administrador.</w:t>
+              <w:t>• Despliegue Automático (CI/CD): Cualquier cambio confirmado a la rama 'main' dispara una nueva compilación y despliegue en menos de 2 minutos.</w:t>
               <w:br/>
-              <w:t>• Conectividad: Acceso universal desde cualquier red Wi-Fi o datos móviles (4G/5G).</w:t>
+              <w:t>• Descarga del APK desde la Web: Incluye un botón verde permanente '📱 Descargar App Android' en la cabecera del portal.</w:t>
             </w:r>
           </w:p>
         </w:tc>
@@ -2973,7 +3626,7 @@
           <w:color w:val="1E40AF"/>
           <w:sz w:val="24"/>
         </w:rPr>
-        <w:t>7.1 Cómo Usar la Nueva Pantalla de Inicio / Bienvenida del Portal</w:t>
+        <w:t>7.1 Cómo Descargar e Instalar la Aplicación en Teléfonos Android</w:t>
       </w:r>
     </w:p>
     <w:p>
@@ -2986,14 +3639,14 @@
           <w:color w:val="0F172A"/>
           <w:sz w:val="20"/>
         </w:rPr>
-        <w:t xml:space="preserve">Paso 1: Acceso Directo: </w:t>
+        <w:t xml:space="preserve">Paso 1: Descarga del APK: </w:t>
       </w:r>
       <w:r>
         <w:rPr>
           <w:color w:val="334155"/>
           <w:sz w:val="20"/>
         </w:rPr>
-        <w:t>Abre cualquier navegador web (Chrome, Edge, Safari, Firefox) e ingresa directamente a: https://jlg-facturacion.onrender.com/ El sistema te recibirá con la nueva Pantalla de Inicio y Bienvenida corporativa.</w:t>
+        <w:t>Abre https://jlg-facturacion.onrender.com en el navegador de tu celular y presiona el botón 'Descargar App Android' en la esquina superior derecha, o copia el archivo ViaticosApp.apk desde la computadora.</w:t>
       </w:r>
     </w:p>
     <w:p>
@@ -3006,14 +3659,14 @@
           <w:color w:val="0F172A"/>
           <w:sz w:val="20"/>
         </w:rPr>
-        <w:t xml:space="preserve">Paso 2: Acceso por Nombre Completo (Colaboradores): </w:t>
+        <w:t xml:space="preserve">Paso 2: Permisos de Instalación: </w:t>
       </w:r>
       <w:r>
         <w:rPr>
           <w:color w:val="334155"/>
           <w:sz w:val="20"/>
         </w:rPr>
-        <w:t>En la tarjeta izquierda 'Acceso a Comisionados', despliega el selector por Nombre Completo, visualiza tu resumen de viaje (destino, RFC, avatar) e introduce tu clave alfanumérica confidencial (ej. JALM-2026). Al presionar 'Ingresar a mis Viáticos', accederás directamente a tu comprobación y subida de XML.</w:t>
+        <w:t>Abre el archivo descargado. Si Android solicita confirmación de seguridad, activa la casilla 'Permitir instalación de fuentes desconocidas' para ese navegador o explorador de archivos.</w:t>
       </w:r>
     </w:p>
     <w:p>
@@ -3026,14 +3679,14 @@
           <w:color w:val="0F172A"/>
           <w:sz w:val="20"/>
         </w:rPr>
-        <w:t xml:space="preserve">Paso 3: Acceso Directo de Administrador: </w:t>
+        <w:t xml:space="preserve">Paso 3: Conexión Automática: </w:t>
       </w:r>
       <w:r>
         <w:rPr>
           <w:color w:val="334155"/>
           <w:sz w:val="20"/>
         </w:rPr>
-        <w:t>En la tarjeta derecha 'Iniciar como Administrador', introduce las credenciales maestras (DamianSpears_Owner / Papaleta723!) y haz clic en 'Iniciar como Administrador'. Accederás inmediatamente al Panel de Auditoría para aprobar o rechazar facturas y dar de alta nuevo personal.</w:t>
+        <w:t>La app se conecta de fábrica a los servidores de Render. Los colaboradores pueden comprobar gastos desde carretera, hoteles o aeropuertos usando datos 4G/5G.</w:t>
       </w:r>
     </w:p>
     <w:p>
@@ -3046,29 +3699,29 @@
           <w:color w:val="0F172A"/>
           <w:sz w:val="20"/>
         </w:rPr>
-        <w:t xml:space="preserve">Paso 4: Cambio de Usuario y Cierre de Sesión: </w:t>
+        <w:t xml:space="preserve">Paso 4: Servidor Alternativo: </w:t>
       </w:r>
       <w:r>
         <w:rPr>
           <w:color w:val="334155"/>
           <w:sz w:val="20"/>
         </w:rPr>
-        <w:t>Tanto en el portal de comprobación como en el panel administrador dispones del botón 'Cerrar Sesión / Cambiar Colaborador' en la barra superior para volver de manera inmediata y segura a la Pantalla de Inicio.</w:t>
+        <w:t>Si se trabaja en una red local de pruebas, el usuario puede pulsar el botón de engrane ⚙️ en la barra de la app e ingresar 'http://192.168.100.52:4000/api/' para apuntar al servidor local.</w:t>
       </w:r>
     </w:p>
     <w:p>
       <w:pPr>
-        <w:pStyle w:val="Heading2"/>
+        <w:pStyle w:val="Heading1"/>
         <w:keepNext/>
         <w:spacing w:before="280" w:after="120"/>
       </w:pPr>
       <w:r>
         <w:rPr>
           <w:b/>
-          <w:color w:val="1E40AF"/>
-          <w:sz w:val="24"/>
+          <w:color w:val="0F4C3A"/>
+          <w:sz w:val="30"/>
         </w:rPr>
-        <w:t>7.2 Cómo Conectar los Celulares de los Usuarios (App Android)</w:t>
+        <w:t>8. Preguntas Frecuentes y Solución de Problemas (FAQ)</w:t>
       </w:r>
     </w:p>
     <w:p>
@@ -3081,14 +3734,27 @@
           <w:color w:val="0F172A"/>
           <w:sz w:val="20"/>
         </w:rPr>
-        <w:t xml:space="preserve">Paso 1: Instalación: </w:t>
+        <w:t xml:space="preserve">Pregunta 1: Sincronización en Vivo </w:t>
       </w:r>
       <w:r>
         <w:rPr>
           <w:color w:val="334155"/>
           <w:sz w:val="20"/>
         </w:rPr>
-        <w:t>Copia el archivo 'JLG_Facturacion.apk' a los celulares de los colaboradores (vía WhatsApp, correo o Google Drive) e instálalo habilitando 'Instalar apps desconocidas'.</w:t>
+        <w:t>¿Cómo se entera el portal web cuando un comisionado sube una factura desde su celular?</w:t>
+      </w:r>
+    </w:p>
+    <w:p>
+      <w:pPr>
+        <w:pStyle w:val="ListBullet"/>
+        <w:spacing w:before="0" w:after="60" w:line="276" w:lineRule="auto"/>
+      </w:pPr>
+      <w:r>
+        <w:rPr>
+          <w:color w:val="334155"/>
+          <w:sz w:val="19"/>
+        </w:rPr>
+        <w:t>El portal web ejecuta una sincronización reactiva en tiempo real cada 3 segundos. Cuando el empleado valida una factura en su teléfono, los saldos, el gráfico de barras y la tabla de comprobantes en la pantalla de la web se actualizan al instante sin presionar F5.</w:t>
       </w:r>
     </w:p>
     <w:p>
@@ -3101,14 +3767,27 @@
           <w:color w:val="0F172A"/>
           <w:sz w:val="20"/>
         </w:rPr>
-        <w:t xml:space="preserve">Paso 2: Conexión Automática: </w:t>
+        <w:t xml:space="preserve">Pregunta 2: Tratamiento del IVA y Proporcionalidad </w:t>
       </w:r>
       <w:r>
         <w:rPr>
           <w:color w:val="334155"/>
           <w:sz w:val="20"/>
         </w:rPr>
-        <w:t>La aplicación ya viene configurada de fábrica con la URL cloud 'https://jlg-facturacion.onrender.com/api/'. En cuanto el colaborador abre la app, esta se conecta automáticamente a la nube.</w:t>
+        <w:t>¿Qué sucede con los impuestos locales y el IVA de las facturas?</w:t>
+      </w:r>
+    </w:p>
+    <w:p>
+      <w:pPr>
+        <w:pStyle w:val="ListBullet"/>
+        <w:spacing w:before="0" w:after="60" w:line="276" w:lineRule="auto"/>
+      </w:pPr>
+      <w:r>
+        <w:rPr>
+          <w:color w:val="334155"/>
+          <w:sz w:val="19"/>
+        </w:rPr>
+        <w:t>El sistema calcula el IVA al 16% sobre la base deducible. Cuando un gasto de alimentos excede los $750.00 diarios, el IVA correspondiente al excedente se convierte en no acreditable de conformidad con el Artículo 5 Fracción I de la Ley del IVA.</w:t>
       </w:r>
     </w:p>
     <w:p>
@@ -3121,34 +3800,27 @@
           <w:color w:val="0F172A"/>
           <w:sz w:val="20"/>
         </w:rPr>
-        <w:t xml:space="preserve">Paso 3: Conexión Universal: </w:t>
+        <w:t xml:space="preserve">Pregunta 3: Seguridad de Datos </w:t>
       </w:r>
       <w:r>
         <w:rPr>
           <w:color w:val="334155"/>
           <w:sz w:val="20"/>
         </w:rPr>
-        <w:t>Los colaboradores pueden estar en su casa, en la oficina o en carretera con datos móviles 4G/5G. No se requiere estar en la misma red Wi-Fi.</w:t>
+        <w:t>¿Dónde se almacena la información fiscal?</w:t>
       </w:r>
     </w:p>
     <w:p>
       <w:pPr>
-        <w:spacing w:before="0" w:after="80" w:line="276" w:lineRule="auto"/>
+        <w:pStyle w:val="ListBullet"/>
+        <w:spacing w:before="0" w:after="60" w:line="276" w:lineRule="auto"/>
       </w:pPr>
       <w:r>
         <w:rPr>
-          <w:b/>
-          <w:color w:val="0F172A"/>
-          <w:sz w:val="20"/>
+          <w:color w:val="334155"/>
+          <w:sz w:val="19"/>
         </w:rPr>
-        <w:t xml:space="preserve">Paso 4: Flexibilidad de Servidor: </w:t>
-      </w:r>
-      <w:r>
-        <w:rPr>
-          <w:color w:val="334155"/>
-          <w:sz w:val="20"/>
-        </w:rPr>
-        <w:t>Si en el futuro se desea apuntar a otro servidor privado o red local, la app cuenta con el botón de engrane ⚙️ en la esquina superior derecha para personalizar la URL del backend.</w:t>
+        <w:t>Las facturas y datos de colaboradores se almacenan de manera estructurada en portal-viaticos/data/comprobantes.json. Ninguna contraseña de administrador se guarda en texto plano; todas están hasheadas con Bcrypt.</w:t>
       </w:r>
     </w:p>
     <w:sectPr>

</xml_diff>